<commit_message>
fix: standardize region wording as Quanzhou Nan'an
</commit_message>
<xml_diff>
--- a/binhai-hospital-geo-diagnosis/working-documents/全阶段_审核成员项目协作交接手册_2026-08-23.docx
+++ b/binhai-hospital-geo-diagnosis/working-documents/全阶段_审核成员项目协作交接手册_2026-08-23.docx
@@ -339,7 +339,7 @@
           <w:sz w:val="21"/>
           <w:szCs w:val="21"/>
         </w:rPr>
-        <w:t xml:space="preserve">已知信息：客户原话中的城市为“泉州南安”；当前第一阶段执行地域明确为泉州市南安市，不是整个泉州市。业务为泌尿系结石相关就医场景。案件代号“泌尿诊断A”和产品线“诊断”是 W / 项目内部设置，不是客户原话。</w:t>
+        <w:t xml:space="preserve">已知信息：客户原话中的城市和当前第一阶段执行地域均统一为“泉州南安”，不是整个泉州。业务为泌尿系结石相关就医场景。案件代号“泌尿诊断A”和产品线“诊断”是 W / 项目内部设置，不是客户原话。</w:t>
       </w:r>
     </w:p>
     <w:p>
@@ -523,8 +523,8 @@
           <w:b/>
           <w:bCs/>
           <w:color w:val="154C66"/>
-          <w:sz w:val="24"/>
-          <w:szCs w:val="24"/>
+          <w:sz w:val="22"/>
+          <w:szCs w:val="22"/>
         </w:rPr>
         <w:t xml:space="preserve">第一步：阅读</w:t>
       </w:r>
@@ -782,6 +782,393 @@
     <w:p>
       <w:pPr>
         <w:pStyle w:val="Heading3"/>
+        <w:keepNext/>
+        <w:widowControl/>
+        <w:spacing w:after="130" w:before="260"/>
+      </w:pPr>
+      <w:r>
+        <w:rPr>
+          <w:rFonts w:ascii="Microsoft YaHei" w:cs="Microsoft YaHei" w:eastAsia="Microsoft YaHei" w:hAnsi="Microsoft YaHei"/>
+          <w:b/>
+          <w:bCs/>
+          <w:color w:val="154C66"/>
+          <w:sz w:val="22"/>
+          <w:szCs w:val="22"/>
+        </w:rPr>
+        <w:t xml:space="preserve">第二步：独立质检</w:t>
+      </w:r>
+    </w:p>
+    <w:p>
+      <w:pPr>
+        <w:keepNext w:val="false"/>
+        <w:keepLines/>
+        <w:widowControl/>
+        <w:spacing w:after="120" w:before="0" w:line="360"/>
+      </w:pPr>
+      <w:r>
+        <w:rPr>
+          <w:rFonts w:ascii="Microsoft YaHei" w:cs="Microsoft YaHei" w:eastAsia="Microsoft YaHei" w:hAnsi="Microsoft YaHei"/>
+          <w:b w:val="false"/>
+          <w:bCs w:val="false"/>
+          <w:i w:val="false"/>
+          <w:iCs w:val="false"/>
+          <w:color w:val="1F2937"/>
+          <w:sz w:val="21"/>
+          <w:szCs w:val="21"/>
+        </w:rPr>
+        <w:t xml:space="preserve">不要先问 W “标准答案”。独立检查：</w:t>
+      </w:r>
+    </w:p>
+    <w:p>
+      <w:pPr>
+        <w:pStyle w:val="ListParagraph"/>
+        <w:keepNext w:val="false"/>
+        <w:keepLines/>
+        <w:widowControl/>
+        <w:numPr>
+          <w:ilvl w:val="0"/>
+          <w:numId w:val="1"/>
+        </w:numPr>
+        <w:spacing w:after="70" w:before="0" w:line="360"/>
+      </w:pPr>
+      <w:r>
+        <w:rPr>
+          <w:rFonts w:ascii="Microsoft YaHei" w:cs="Microsoft YaHei" w:eastAsia="Microsoft YaHei" w:hAnsi="Microsoft YaHei"/>
+          <w:b w:val="false"/>
+          <w:bCs w:val="false"/>
+          <w:i w:val="false"/>
+          <w:iCs w:val="false"/>
+          <w:color w:val="1F2937"/>
+          <w:sz w:val="21"/>
+          <w:szCs w:val="21"/>
+        </w:rPr>
+        <w:t xml:space="preserve">完整：客户原话中的城市与需求是否齐全；第一阶段是否明确只覆盖泉州南安；客户代号、产品线和禁售确认是否有清楚的内部来源。</w:t>
+      </w:r>
+    </w:p>
+    <w:p>
+      <w:pPr>
+        <w:pStyle w:val="ListParagraph"/>
+        <w:keepNext w:val="false"/>
+        <w:keepLines/>
+        <w:widowControl/>
+        <w:numPr>
+          <w:ilvl w:val="0"/>
+          <w:numId w:val="1"/>
+        </w:numPr>
+        <w:spacing w:after="70" w:before="0" w:line="360"/>
+      </w:pPr>
+      <w:r>
+        <w:rPr>
+          <w:rFonts w:ascii="Microsoft YaHei" w:cs="Microsoft YaHei" w:eastAsia="Microsoft YaHei" w:hAnsi="Microsoft YaHei"/>
+          <w:b w:val="false"/>
+          <w:bCs w:val="false"/>
+          <w:i w:val="false"/>
+          <w:iCs w:val="false"/>
+          <w:color w:val="1F2937"/>
+          <w:sz w:val="21"/>
+          <w:szCs w:val="21"/>
+        </w:rPr>
+        <w:t xml:space="preserve">正确：是否把“可能风险”写成“确认结石”，是否保证推荐。</w:t>
+      </w:r>
+    </w:p>
+    <w:p>
+      <w:pPr>
+        <w:pStyle w:val="ListParagraph"/>
+        <w:keepNext w:val="false"/>
+        <w:keepLines/>
+        <w:widowControl/>
+        <w:numPr>
+          <w:ilvl w:val="0"/>
+          <w:numId w:val="1"/>
+        </w:numPr>
+        <w:spacing w:after="70" w:before="0" w:line="360"/>
+      </w:pPr>
+      <w:r>
+        <w:rPr>
+          <w:rFonts w:ascii="Microsoft YaHei" w:cs="Microsoft YaHei" w:eastAsia="Microsoft YaHei" w:hAnsi="Microsoft YaHei"/>
+          <w:b w:val="false"/>
+          <w:bCs w:val="false"/>
+          <w:i w:val="false"/>
+          <w:iCs w:val="false"/>
+          <w:color w:val="1F2937"/>
+          <w:sz w:val="21"/>
+          <w:szCs w:val="21"/>
+        </w:rPr>
+        <w:t xml:space="preserve">一致：是否始终只有“诊断”一条产品线。</w:t>
+      </w:r>
+    </w:p>
+    <w:p>
+      <w:pPr>
+        <w:pStyle w:val="ListParagraph"/>
+        <w:keepNext w:val="false"/>
+        <w:keepLines/>
+        <w:widowControl/>
+        <w:numPr>
+          <w:ilvl w:val="0"/>
+          <w:numId w:val="1"/>
+        </w:numPr>
+        <w:spacing w:after="70" w:before="0" w:line="360"/>
+      </w:pPr>
+      <w:r>
+        <w:rPr>
+          <w:rFonts w:ascii="Microsoft YaHei" w:cs="Microsoft YaHei" w:eastAsia="Microsoft YaHei" w:hAnsi="Microsoft YaHei"/>
+          <w:b w:val="false"/>
+          <w:bCs w:val="false"/>
+          <w:i w:val="false"/>
+          <w:iCs w:val="false"/>
+          <w:color w:val="1F2937"/>
+          <w:sz w:val="21"/>
+          <w:szCs w:val="21"/>
+        </w:rPr>
+        <w:t xml:space="preserve">可追溯：每条客户事实是否回到 R0001—R0003；内部设置是否回到 W / R0004，二者不得混写。</w:t>
+      </w:r>
+    </w:p>
+    <w:p>
+      <w:pPr>
+        <w:pStyle w:val="ListParagraph"/>
+        <w:keepNext w:val="false"/>
+        <w:keepLines/>
+        <w:widowControl/>
+        <w:numPr>
+          <w:ilvl w:val="0"/>
+          <w:numId w:val="1"/>
+        </w:numPr>
+        <w:spacing w:after="70" w:before="0" w:line="360"/>
+      </w:pPr>
+      <w:r>
+        <w:rPr>
+          <w:rFonts w:ascii="Microsoft YaHei" w:cs="Microsoft YaHei" w:eastAsia="Microsoft YaHei" w:hAnsi="Microsoft YaHei"/>
+          <w:b w:val="false"/>
+          <w:bCs w:val="false"/>
+          <w:i w:val="false"/>
+          <w:iCs w:val="false"/>
+          <w:color w:val="1F2937"/>
+          <w:sz w:val="21"/>
+          <w:szCs w:val="21"/>
+        </w:rPr>
+        <w:t xml:space="preserve">可执行：是否需要读取未经授权的位置，是否超出医疗合规边界。</w:t>
+      </w:r>
+    </w:p>
+    <w:p>
+      <w:pPr>
+        <w:pStyle w:val="ListParagraph"/>
+        <w:keepNext w:val="false"/>
+        <w:keepLines/>
+        <w:widowControl/>
+        <w:numPr>
+          <w:ilvl w:val="0"/>
+          <w:numId w:val="1"/>
+        </w:numPr>
+        <w:spacing w:after="70" w:before="0" w:line="360"/>
+      </w:pPr>
+      <w:r>
+        <w:rPr>
+          <w:rFonts w:ascii="Microsoft YaHei" w:cs="Microsoft YaHei" w:eastAsia="Microsoft YaHei" w:hAnsi="Microsoft YaHei"/>
+          <w:b w:val="false"/>
+          <w:bCs w:val="false"/>
+          <w:i w:val="false"/>
+          <w:iCs w:val="false"/>
+          <w:color w:val="1F2937"/>
+          <w:sz w:val="21"/>
+          <w:szCs w:val="21"/>
+        </w:rPr>
+        <w:t xml:space="preserve">地域准确：是否把仅说明“泉州”的用户或泉州其他地区错误纳入泉州南安范围。</w:t>
+      </w:r>
+    </w:p>
+    <w:p>
+      <w:pPr>
+        <w:pStyle w:val="Heading3"/>
+        <w:keepNext/>
+        <w:widowControl/>
+        <w:spacing w:after="130" w:before="260"/>
+      </w:pPr>
+      <w:r>
+        <w:rPr>
+          <w:rFonts w:ascii="Microsoft YaHei" w:cs="Microsoft YaHei" w:eastAsia="Microsoft YaHei" w:hAnsi="Microsoft YaHei"/>
+          <w:b/>
+          <w:bCs/>
+          <w:color w:val="154C66"/>
+          <w:sz w:val="22"/>
+          <w:szCs w:val="22"/>
+        </w:rPr>
+        <w:t xml:space="preserve">第三步：交付复核意见</w:t>
+      </w:r>
+    </w:p>
+    <w:p>
+      <w:pPr>
+        <w:keepNext w:val="false"/>
+        <w:keepLines/>
+        <w:widowControl/>
+        <w:spacing w:after="120" w:before="0" w:line="360"/>
+      </w:pPr>
+      <w:r>
+        <w:rPr>
+          <w:rFonts w:ascii="Microsoft YaHei" w:cs="Microsoft YaHei" w:eastAsia="Microsoft YaHei" w:hAnsi="Microsoft YaHei"/>
+          <w:b w:val="false"/>
+          <w:bCs w:val="false"/>
+          <w:i w:val="false"/>
+          <w:iCs w:val="false"/>
+          <w:color w:val="1F2937"/>
+          <w:sz w:val="21"/>
+          <w:szCs w:val="21"/>
+        </w:rPr>
+        <w:t xml:space="preserve">输出格式：</w:t>
+      </w:r>
+    </w:p>
+    <w:p>
+      <w:pPr>
+        <w:pStyle w:val="ListParagraph"/>
+        <w:keepNext w:val="false"/>
+        <w:keepLines/>
+        <w:widowControl/>
+        <w:numPr>
+          <w:ilvl w:val="0"/>
+          <w:numId w:val="1"/>
+        </w:numPr>
+        <w:spacing w:after="70" w:before="0" w:line="360"/>
+      </w:pPr>
+      <w:r>
+        <w:rPr>
+          <w:rFonts w:ascii="Microsoft YaHei" w:cs="Microsoft YaHei" w:eastAsia="Microsoft YaHei" w:hAnsi="Microsoft YaHei"/>
+          <w:b w:val="false"/>
+          <w:bCs w:val="false"/>
+          <w:i w:val="false"/>
+          <w:iCs w:val="false"/>
+          <w:color w:val="1F2937"/>
+          <w:sz w:val="21"/>
+          <w:szCs w:val="21"/>
+        </w:rPr>
+        <w:t xml:space="preserve">结论：通过 / 要改。</w:t>
+      </w:r>
+    </w:p>
+    <w:p>
+      <w:pPr>
+        <w:pStyle w:val="ListParagraph"/>
+        <w:keepNext w:val="false"/>
+        <w:keepLines/>
+        <w:widowControl/>
+        <w:numPr>
+          <w:ilvl w:val="0"/>
+          <w:numId w:val="1"/>
+        </w:numPr>
+        <w:spacing w:after="70" w:before="0" w:line="360"/>
+      </w:pPr>
+      <w:r>
+        <w:rPr>
+          <w:rFonts w:ascii="Microsoft YaHei" w:cs="Microsoft YaHei" w:eastAsia="Microsoft YaHei" w:hAnsi="Microsoft YaHei"/>
+          <w:b w:val="false"/>
+          <w:bCs w:val="false"/>
+          <w:i w:val="false"/>
+          <w:iCs w:val="false"/>
+          <w:color w:val="1F2937"/>
+          <w:sz w:val="21"/>
+          <w:szCs w:val="21"/>
+        </w:rPr>
+        <w:t xml:space="preserve">必改项：逐条引用问题句并给出改口建议。</w:t>
+      </w:r>
+    </w:p>
+    <w:p>
+      <w:pPr>
+        <w:pStyle w:val="ListParagraph"/>
+        <w:keepNext w:val="false"/>
+        <w:keepLines/>
+        <w:widowControl/>
+        <w:numPr>
+          <w:ilvl w:val="0"/>
+          <w:numId w:val="1"/>
+        </w:numPr>
+        <w:spacing w:after="70" w:before="0" w:line="360"/>
+      </w:pPr>
+      <w:r>
+        <w:rPr>
+          <w:rFonts w:ascii="Microsoft YaHei" w:cs="Microsoft YaHei" w:eastAsia="Microsoft YaHei" w:hAnsi="Microsoft YaHei"/>
+          <w:b w:val="false"/>
+          <w:bCs w:val="false"/>
+          <w:i w:val="false"/>
+          <w:iCs w:val="false"/>
+          <w:color w:val="1F2937"/>
+          <w:sz w:val="21"/>
+          <w:szCs w:val="21"/>
+        </w:rPr>
+        <w:t xml:space="preserve">待确认项：只列事实缺口，不自行补事实。</w:t>
+      </w:r>
+    </w:p>
+    <w:p>
+      <w:pPr>
+        <w:pStyle w:val="ListParagraph"/>
+        <w:keepNext w:val="false"/>
+        <w:keepLines/>
+        <w:widowControl/>
+        <w:numPr>
+          <w:ilvl w:val="0"/>
+          <w:numId w:val="1"/>
+        </w:numPr>
+        <w:spacing w:after="70" w:before="0" w:line="360"/>
+      </w:pPr>
+      <w:r>
+        <w:rPr>
+          <w:rFonts w:ascii="Microsoft YaHei" w:cs="Microsoft YaHei" w:eastAsia="Microsoft YaHei" w:hAnsi="Microsoft YaHei"/>
+          <w:b w:val="false"/>
+          <w:bCs w:val="false"/>
+          <w:i w:val="false"/>
+          <w:iCs w:val="false"/>
+          <w:color w:val="1F2937"/>
+          <w:sz w:val="21"/>
+          <w:szCs w:val="21"/>
+        </w:rPr>
+        <w:t xml:space="preserve">路径核对：写明你检查过的原始材料和草稿路径。</w:t>
+      </w:r>
+    </w:p>
+    <w:p>
+      <w:pPr>
+        <w:pStyle w:val="ListParagraph"/>
+        <w:keepNext w:val="false"/>
+        <w:keepLines/>
+        <w:widowControl/>
+        <w:numPr>
+          <w:ilvl w:val="0"/>
+          <w:numId w:val="1"/>
+        </w:numPr>
+        <w:spacing w:after="70" w:before="0" w:line="360"/>
+      </w:pPr>
+      <w:r>
+        <w:rPr>
+          <w:rFonts w:ascii="Microsoft YaHei" w:cs="Microsoft YaHei" w:eastAsia="Microsoft YaHei" w:hAnsi="Microsoft YaHei"/>
+          <w:b w:val="false"/>
+          <w:bCs w:val="false"/>
+          <w:i w:val="false"/>
+          <w:iCs w:val="false"/>
+          <w:color w:val="1F2937"/>
+          <w:sz w:val="21"/>
+          <w:szCs w:val="21"/>
+        </w:rPr>
+        <w:t xml:space="preserve">签名：L；本次角色为“成员 / 01 独立复核”，不是 G1、G3、G4 或 G8 的正式第二角色。</w:t>
+      </w:r>
+    </w:p>
+    <w:p>
+      <w:pPr>
+        <w:keepNext w:val="false"/>
+        <w:keepLines/>
+        <w:widowControl/>
+        <w:spacing w:after="120" w:before="0" w:line="360"/>
+      </w:pPr>
+      <w:r>
+        <w:rPr>
+          <w:rFonts w:ascii="Microsoft YaHei" w:cs="Microsoft YaHei" w:eastAsia="Microsoft YaHei" w:hAnsi="Microsoft YaHei"/>
+          <w:b w:val="false"/>
+          <w:bCs w:val="false"/>
+          <w:i w:val="false"/>
+          <w:iCs w:val="false"/>
+          <w:color w:val="1F2937"/>
+          <w:sz w:val="21"/>
+          <w:szCs w:val="21"/>
+        </w:rPr>
+        <w:t xml:space="preserve">将复核意见交给 W。你不能代替 W 批准 G0。</w:t>
+      </w:r>
+    </w:p>
+    <w:p>
+      <w:pPr>
+        <w:pStyle w:val="Heading2"/>
         <w:keepNext/>
         <w:widowControl/>
         <w:spacing w:after="130" w:before="260"/>
@@ -795,189 +1182,220 @@
           <w:sz w:val="24"/>
           <w:szCs w:val="24"/>
         </w:rPr>
-        <w:t xml:space="preserve">第二步：独立质检</w:t>
-      </w:r>
-    </w:p>
-    <w:p>
-      <w:pPr>
-        <w:keepNext w:val="false"/>
-        <w:keepLines/>
-        <w:widowControl/>
-        <w:spacing w:after="120" w:before="0" w:line="360"/>
-      </w:pPr>
-      <w:r>
-        <w:rPr>
-          <w:rFonts w:ascii="Microsoft YaHei" w:cs="Microsoft YaHei" w:eastAsia="Microsoft YaHei" w:hAnsi="Microsoft YaHei"/>
-          <w:b w:val="false"/>
-          <w:bCs w:val="false"/>
-          <w:i w:val="false"/>
-          <w:iCs w:val="false"/>
-          <w:color w:val="1F2937"/>
-          <w:sz w:val="21"/>
-          <w:szCs w:val="21"/>
-        </w:rPr>
-        <w:t xml:space="preserve">不要先问 W “标准答案”。独立检查：</w:t>
-      </w:r>
-    </w:p>
-    <w:p>
-      <w:pPr>
-        <w:pStyle w:val="ListParagraph"/>
-        <w:keepNext w:val="false"/>
-        <w:keepLines/>
-        <w:widowControl/>
-        <w:numPr>
-          <w:ilvl w:val="0"/>
-          <w:numId w:val="1"/>
-        </w:numPr>
-        <w:spacing w:after="70" w:before="0" w:line="360"/>
-      </w:pPr>
-      <w:r>
-        <w:rPr>
-          <w:rFonts w:ascii="Microsoft YaHei" w:cs="Microsoft YaHei" w:eastAsia="Microsoft YaHei" w:hAnsi="Microsoft YaHei"/>
-          <w:b w:val="false"/>
-          <w:bCs w:val="false"/>
-          <w:i w:val="false"/>
-          <w:iCs w:val="false"/>
-          <w:color w:val="1F2937"/>
-          <w:sz w:val="21"/>
-          <w:szCs w:val="21"/>
-        </w:rPr>
-        <w:t xml:space="preserve">完整：客户原话中的城市与需求是否齐全；第一阶段是否明确只覆盖泉州市南安市；客户代号、产品线和禁售确认是否有清楚的内部来源。</w:t>
-      </w:r>
-    </w:p>
-    <w:p>
-      <w:pPr>
-        <w:pStyle w:val="ListParagraph"/>
-        <w:keepNext w:val="false"/>
-        <w:keepLines/>
-        <w:widowControl/>
-        <w:numPr>
-          <w:ilvl w:val="0"/>
-          <w:numId w:val="1"/>
-        </w:numPr>
-        <w:spacing w:after="70" w:before="0" w:line="360"/>
-      </w:pPr>
-      <w:r>
-        <w:rPr>
-          <w:rFonts w:ascii="Microsoft YaHei" w:cs="Microsoft YaHei" w:eastAsia="Microsoft YaHei" w:hAnsi="Microsoft YaHei"/>
-          <w:b w:val="false"/>
-          <w:bCs w:val="false"/>
-          <w:i w:val="false"/>
-          <w:iCs w:val="false"/>
-          <w:color w:val="1F2937"/>
-          <w:sz w:val="21"/>
-          <w:szCs w:val="21"/>
-        </w:rPr>
-        <w:t xml:space="preserve">正确：是否把“可能风险”写成“确认结石”，是否保证推荐。</w:t>
-      </w:r>
-    </w:p>
-    <w:p>
-      <w:pPr>
-        <w:pStyle w:val="ListParagraph"/>
-        <w:keepNext w:val="false"/>
-        <w:keepLines/>
-        <w:widowControl/>
-        <w:numPr>
-          <w:ilvl w:val="0"/>
-          <w:numId w:val="1"/>
-        </w:numPr>
-        <w:spacing w:after="70" w:before="0" w:line="360"/>
-      </w:pPr>
-      <w:r>
-        <w:rPr>
-          <w:rFonts w:ascii="Microsoft YaHei" w:cs="Microsoft YaHei" w:eastAsia="Microsoft YaHei" w:hAnsi="Microsoft YaHei"/>
-          <w:b w:val="false"/>
-          <w:bCs w:val="false"/>
-          <w:i w:val="false"/>
-          <w:iCs w:val="false"/>
-          <w:color w:val="1F2937"/>
-          <w:sz w:val="21"/>
-          <w:szCs w:val="21"/>
-        </w:rPr>
-        <w:t xml:space="preserve">一致：是否始终只有“诊断”一条产品线。</w:t>
-      </w:r>
-    </w:p>
-    <w:p>
-      <w:pPr>
-        <w:pStyle w:val="ListParagraph"/>
-        <w:keepNext w:val="false"/>
-        <w:keepLines/>
-        <w:widowControl/>
-        <w:numPr>
-          <w:ilvl w:val="0"/>
-          <w:numId w:val="1"/>
-        </w:numPr>
-        <w:spacing w:after="70" w:before="0" w:line="360"/>
-      </w:pPr>
-      <w:r>
-        <w:rPr>
-          <w:rFonts w:ascii="Microsoft YaHei" w:cs="Microsoft YaHei" w:eastAsia="Microsoft YaHei" w:hAnsi="Microsoft YaHei"/>
-          <w:b w:val="false"/>
-          <w:bCs w:val="false"/>
-          <w:i w:val="false"/>
-          <w:iCs w:val="false"/>
-          <w:color w:val="1F2937"/>
-          <w:sz w:val="21"/>
-          <w:szCs w:val="21"/>
-        </w:rPr>
-        <w:t xml:space="preserve">可追溯：每条客户事实是否回到 R0001—R0003；内部设置是否回到 W / R0004，二者不得混写。</w:t>
-      </w:r>
-    </w:p>
-    <w:p>
-      <w:pPr>
-        <w:pStyle w:val="ListParagraph"/>
-        <w:keepNext w:val="false"/>
-        <w:keepLines/>
-        <w:widowControl/>
-        <w:numPr>
-          <w:ilvl w:val="0"/>
-          <w:numId w:val="1"/>
-        </w:numPr>
-        <w:spacing w:after="70" w:before="0" w:line="360"/>
-      </w:pPr>
-      <w:r>
-        <w:rPr>
-          <w:rFonts w:ascii="Microsoft YaHei" w:cs="Microsoft YaHei" w:eastAsia="Microsoft YaHei" w:hAnsi="Microsoft YaHei"/>
-          <w:b w:val="false"/>
-          <w:bCs w:val="false"/>
-          <w:i w:val="false"/>
-          <w:iCs w:val="false"/>
-          <w:color w:val="1F2937"/>
-          <w:sz w:val="21"/>
-          <w:szCs w:val="21"/>
-        </w:rPr>
-        <w:t xml:space="preserve">可执行：是否需要读取未经授权的位置，是否超出医疗合规边界。</w:t>
-      </w:r>
-    </w:p>
-    <w:p>
-      <w:pPr>
-        <w:pStyle w:val="ListParagraph"/>
-        <w:keepNext w:val="false"/>
-        <w:keepLines/>
-        <w:widowControl/>
-        <w:numPr>
-          <w:ilvl w:val="0"/>
-          <w:numId w:val="1"/>
-        </w:numPr>
-        <w:spacing w:after="70" w:before="0" w:line="360"/>
-      </w:pPr>
-      <w:r>
-        <w:rPr>
-          <w:rFonts w:ascii="Microsoft YaHei" w:cs="Microsoft YaHei" w:eastAsia="Microsoft YaHei" w:hAnsi="Microsoft YaHei"/>
-          <w:b w:val="false"/>
-          <w:bCs w:val="false"/>
-          <w:i w:val="false"/>
-          <w:iCs w:val="false"/>
-          <w:color w:val="1F2937"/>
-          <w:sz w:val="21"/>
-          <w:szCs w:val="21"/>
-        </w:rPr>
-        <w:t xml:space="preserve">地域准确：是否把仅说明“泉州”的用户错误纳入，或把泉州市其他区县当成南安市。</w:t>
-      </w:r>
-    </w:p>
-    <w:p>
-      <w:pPr>
-        <w:pStyle w:val="Heading3"/>
+        <w:t xml:space="preserve">5. 医疗与隐私边界</w:t>
+      </w:r>
+    </w:p>
+    <w:p>
+      <w:pPr>
+        <w:pStyle w:val="ListParagraph"/>
+        <w:keepNext w:val="false"/>
+        <w:keepLines/>
+        <w:widowControl/>
+        <w:numPr>
+          <w:ilvl w:val="0"/>
+          <w:numId w:val="1"/>
+        </w:numPr>
+        <w:spacing w:after="70" w:before="0" w:line="360"/>
+      </w:pPr>
+      <w:r>
+        <w:rPr>
+          <w:rFonts w:ascii="Microsoft YaHei" w:cs="Microsoft YaHei" w:eastAsia="Microsoft YaHei" w:hAnsi="Microsoft YaHei"/>
+          <w:b w:val="false"/>
+          <w:bCs w:val="false"/>
+          <w:i w:val="false"/>
+          <w:iCs w:val="false"/>
+          <w:color w:val="1F2937"/>
+          <w:sz w:val="21"/>
+          <w:szCs w:val="21"/>
+        </w:rPr>
+        <w:t xml:space="preserve">可以：提示症状可能对应多种风险，建议出现剧烈疼痛、血尿等警示时及时就医。</w:t>
+      </w:r>
+    </w:p>
+    <w:p>
+      <w:pPr>
+        <w:pStyle w:val="ListParagraph"/>
+        <w:keepNext w:val="false"/>
+        <w:keepLines/>
+        <w:widowControl/>
+        <w:numPr>
+          <w:ilvl w:val="0"/>
+          <w:numId w:val="1"/>
+        </w:numPr>
+        <w:spacing w:after="70" w:before="0" w:line="360"/>
+      </w:pPr>
+      <w:r>
+        <w:rPr>
+          <w:rFonts w:ascii="Microsoft YaHei" w:cs="Microsoft YaHei" w:eastAsia="Microsoft YaHei" w:hAnsi="Microsoft YaHei"/>
+          <w:b w:val="false"/>
+          <w:bCs w:val="false"/>
+          <w:i w:val="false"/>
+          <w:iCs w:val="false"/>
+          <w:color w:val="1F2937"/>
+          <w:sz w:val="21"/>
+          <w:szCs w:val="21"/>
+        </w:rPr>
+        <w:t xml:space="preserve">不可以：根据几项症状确认结石、给出具体治疗方案或替代医生诊断。</w:t>
+      </w:r>
+    </w:p>
+    <w:p>
+      <w:pPr>
+        <w:pStyle w:val="ListParagraph"/>
+        <w:keepNext w:val="false"/>
+        <w:keepLines/>
+        <w:widowControl/>
+        <w:numPr>
+          <w:ilvl w:val="0"/>
+          <w:numId w:val="1"/>
+        </w:numPr>
+        <w:spacing w:after="70" w:before="0" w:line="360"/>
+      </w:pPr>
+      <w:r>
+        <w:rPr>
+          <w:rFonts w:ascii="Microsoft YaHei" w:cs="Microsoft YaHei" w:eastAsia="Microsoft YaHei" w:hAnsi="Microsoft YaHei"/>
+          <w:b w:val="false"/>
+          <w:bCs w:val="false"/>
+          <w:i w:val="false"/>
+          <w:iCs w:val="false"/>
+          <w:color w:val="1F2937"/>
+          <w:sz w:val="21"/>
+          <w:szCs w:val="21"/>
+        </w:rPr>
+        <w:t xml:space="preserve">可以：用户主动说明所在地区并授权使用时，把地区作为观察条件。</w:t>
+      </w:r>
+    </w:p>
+    <w:p>
+      <w:pPr>
+        <w:pStyle w:val="ListParagraph"/>
+        <w:keepNext w:val="false"/>
+        <w:keepLines/>
+        <w:widowControl/>
+        <w:numPr>
+          <w:ilvl w:val="0"/>
+          <w:numId w:val="1"/>
+        </w:numPr>
+        <w:spacing w:after="70" w:before="0" w:line="360"/>
+      </w:pPr>
+      <w:r>
+        <w:rPr>
+          <w:rFonts w:ascii="Microsoft YaHei" w:cs="Microsoft YaHei" w:eastAsia="Microsoft YaHei" w:hAnsi="Microsoft YaHei"/>
+          <w:b w:val="false"/>
+          <w:bCs w:val="false"/>
+          <w:i w:val="false"/>
+          <w:iCs w:val="false"/>
+          <w:color w:val="1F2937"/>
+          <w:sz w:val="21"/>
+          <w:szCs w:val="21"/>
+        </w:rPr>
+        <w:t xml:space="preserve">不可以：后台读取、推断或长期保存精确地址。</w:t>
+      </w:r>
+    </w:p>
+    <w:p>
+      <w:pPr>
+        <w:pStyle w:val="ListParagraph"/>
+        <w:keepNext w:val="false"/>
+        <w:keepLines/>
+        <w:widowControl/>
+        <w:numPr>
+          <w:ilvl w:val="0"/>
+          <w:numId w:val="1"/>
+        </w:numPr>
+        <w:spacing w:after="70" w:before="0" w:line="360"/>
+      </w:pPr>
+      <w:r>
+        <w:rPr>
+          <w:rFonts w:ascii="Microsoft YaHei" w:cs="Microsoft YaHei" w:eastAsia="Microsoft YaHei" w:hAnsi="Microsoft YaHei"/>
+          <w:b w:val="false"/>
+          <w:bCs w:val="false"/>
+          <w:i w:val="false"/>
+          <w:iCs w:val="false"/>
+          <w:color w:val="1F2937"/>
+          <w:sz w:val="21"/>
+          <w:szCs w:val="21"/>
+        </w:rPr>
+        <w:t xml:space="preserve">当前地区判定：只有用户授权后主动明确说明“泉州南安”才满足第一阶段条件；仅说明“泉州”或位于泉州其他地区，不纳入本阶段。</w:t>
+      </w:r>
+    </w:p>
+    <w:p>
+      <w:pPr>
+        <w:pStyle w:val="ListParagraph"/>
+        <w:keepNext w:val="false"/>
+        <w:keepLines/>
+        <w:widowControl/>
+        <w:numPr>
+          <w:ilvl w:val="0"/>
+          <w:numId w:val="1"/>
+        </w:numPr>
+        <w:spacing w:after="70" w:before="0" w:line="360"/>
+      </w:pPr>
+      <w:r>
+        <w:rPr>
+          <w:rFonts w:ascii="Microsoft YaHei" w:cs="Microsoft YaHei" w:eastAsia="Microsoft YaHei" w:hAnsi="Microsoft YaHei"/>
+          <w:b w:val="false"/>
+          <w:bCs w:val="false"/>
+          <w:i w:val="false"/>
+          <w:iCs w:val="false"/>
+          <w:color w:val="1F2937"/>
+          <w:sz w:val="21"/>
+          <w:szCs w:val="21"/>
+        </w:rPr>
+        <w:t xml:space="preserve">后续扩展：整个泉州只能在另行批准后作为新阶段重新冻结，不能直接套用本阶段问法和结论。</w:t>
+      </w:r>
+    </w:p>
+    <w:p>
+      <w:pPr>
+        <w:pStyle w:val="ListParagraph"/>
+        <w:keepNext w:val="false"/>
+        <w:keepLines/>
+        <w:widowControl/>
+        <w:numPr>
+          <w:ilvl w:val="0"/>
+          <w:numId w:val="1"/>
+        </w:numPr>
+        <w:spacing w:after="70" w:before="0" w:line="360"/>
+      </w:pPr>
+      <w:r>
+        <w:rPr>
+          <w:rFonts w:ascii="Microsoft YaHei" w:cs="Microsoft YaHei" w:eastAsia="Microsoft YaHei" w:hAnsi="Microsoft YaHei"/>
+          <w:b w:val="false"/>
+          <w:bCs w:val="false"/>
+          <w:i w:val="false"/>
+          <w:iCs w:val="false"/>
+          <w:color w:val="1F2937"/>
+          <w:sz w:val="21"/>
+          <w:szCs w:val="21"/>
+        </w:rPr>
+        <w:t xml:space="preserve">可以：测量目标机构是否被正确提及。</w:t>
+      </w:r>
+    </w:p>
+    <w:p>
+      <w:pPr>
+        <w:pStyle w:val="ListParagraph"/>
+        <w:keepNext w:val="false"/>
+        <w:keepLines/>
+        <w:widowControl/>
+        <w:numPr>
+          <w:ilvl w:val="0"/>
+          <w:numId w:val="1"/>
+        </w:numPr>
+        <w:spacing w:after="70" w:before="0" w:line="360"/>
+      </w:pPr>
+      <w:r>
+        <w:rPr>
+          <w:rFonts w:ascii="Microsoft YaHei" w:cs="Microsoft YaHei" w:eastAsia="Microsoft YaHei" w:hAnsi="Microsoft YaHei"/>
+          <w:b w:val="false"/>
+          <w:bCs w:val="false"/>
+          <w:i w:val="false"/>
+          <w:iCs w:val="false"/>
+          <w:color w:val="1F2937"/>
+          <w:sz w:val="21"/>
+          <w:szCs w:val="21"/>
+        </w:rPr>
+        <w:t xml:space="preserve">不可以：承诺推荐目标医院、保证排名、保证导诊或报名增长。</w:t>
+      </w:r>
+    </w:p>
+    <w:p>
+      <w:pPr>
+        <w:pStyle w:val="Heading2"/>
         <w:keepNext/>
         <w:widowControl/>
         <w:spacing w:after="130" w:before="260"/>
@@ -991,7 +1409,7 @@
           <w:sz w:val="24"/>
           <w:szCs w:val="24"/>
         </w:rPr>
-        <w:t xml:space="preserve">第三步：交付复核意见</w:t>
+        <w:t xml:space="preserve">6. 你的核心岗位：真实手机 App 测量操作员</w:t>
       </w:r>
     </w:p>
     <w:p>
@@ -1012,137 +1430,7 @@
           <w:sz w:val="21"/>
           <w:szCs w:val="21"/>
         </w:rPr>
-        <w:t xml:space="preserve">输出格式：</w:t>
-      </w:r>
-    </w:p>
-    <w:p>
-      <w:pPr>
-        <w:pStyle w:val="ListParagraph"/>
-        <w:keepNext w:val="false"/>
-        <w:keepLines/>
-        <w:widowControl/>
-        <w:numPr>
-          <w:ilvl w:val="0"/>
-          <w:numId w:val="1"/>
-        </w:numPr>
-        <w:spacing w:after="70" w:before="0" w:line="360"/>
-      </w:pPr>
-      <w:r>
-        <w:rPr>
-          <w:rFonts w:ascii="Microsoft YaHei" w:cs="Microsoft YaHei" w:eastAsia="Microsoft YaHei" w:hAnsi="Microsoft YaHei"/>
-          <w:b w:val="false"/>
-          <w:bCs w:val="false"/>
-          <w:i w:val="false"/>
-          <w:iCs w:val="false"/>
-          <w:color w:val="1F2937"/>
-          <w:sz w:val="21"/>
-          <w:szCs w:val="21"/>
-        </w:rPr>
-        <w:t xml:space="preserve">结论：通过 / 要改。</w:t>
-      </w:r>
-    </w:p>
-    <w:p>
-      <w:pPr>
-        <w:pStyle w:val="ListParagraph"/>
-        <w:keepNext w:val="false"/>
-        <w:keepLines/>
-        <w:widowControl/>
-        <w:numPr>
-          <w:ilvl w:val="0"/>
-          <w:numId w:val="1"/>
-        </w:numPr>
-        <w:spacing w:after="70" w:before="0" w:line="360"/>
-      </w:pPr>
-      <w:r>
-        <w:rPr>
-          <w:rFonts w:ascii="Microsoft YaHei" w:cs="Microsoft YaHei" w:eastAsia="Microsoft YaHei" w:hAnsi="Microsoft YaHei"/>
-          <w:b w:val="false"/>
-          <w:bCs w:val="false"/>
-          <w:i w:val="false"/>
-          <w:iCs w:val="false"/>
-          <w:color w:val="1F2937"/>
-          <w:sz w:val="21"/>
-          <w:szCs w:val="21"/>
-        </w:rPr>
-        <w:t xml:space="preserve">必改项：逐条引用问题句并给出改口建议。</w:t>
-      </w:r>
-    </w:p>
-    <w:p>
-      <w:pPr>
-        <w:pStyle w:val="ListParagraph"/>
-        <w:keepNext w:val="false"/>
-        <w:keepLines/>
-        <w:widowControl/>
-        <w:numPr>
-          <w:ilvl w:val="0"/>
-          <w:numId w:val="1"/>
-        </w:numPr>
-        <w:spacing w:after="70" w:before="0" w:line="360"/>
-      </w:pPr>
-      <w:r>
-        <w:rPr>
-          <w:rFonts w:ascii="Microsoft YaHei" w:cs="Microsoft YaHei" w:eastAsia="Microsoft YaHei" w:hAnsi="Microsoft YaHei"/>
-          <w:b w:val="false"/>
-          <w:bCs w:val="false"/>
-          <w:i w:val="false"/>
-          <w:iCs w:val="false"/>
-          <w:color w:val="1F2937"/>
-          <w:sz w:val="21"/>
-          <w:szCs w:val="21"/>
-        </w:rPr>
-        <w:t xml:space="preserve">待确认项：只列事实缺口，不自行补事实。</w:t>
-      </w:r>
-    </w:p>
-    <w:p>
-      <w:pPr>
-        <w:pStyle w:val="ListParagraph"/>
-        <w:keepNext w:val="false"/>
-        <w:keepLines/>
-        <w:widowControl/>
-        <w:numPr>
-          <w:ilvl w:val="0"/>
-          <w:numId w:val="1"/>
-        </w:numPr>
-        <w:spacing w:after="70" w:before="0" w:line="360"/>
-      </w:pPr>
-      <w:r>
-        <w:rPr>
-          <w:rFonts w:ascii="Microsoft YaHei" w:cs="Microsoft YaHei" w:eastAsia="Microsoft YaHei" w:hAnsi="Microsoft YaHei"/>
-          <w:b w:val="false"/>
-          <w:bCs w:val="false"/>
-          <w:i w:val="false"/>
-          <w:iCs w:val="false"/>
-          <w:color w:val="1F2937"/>
-          <w:sz w:val="21"/>
-          <w:szCs w:val="21"/>
-        </w:rPr>
-        <w:t xml:space="preserve">路径核对：写明你检查过的原始材料和草稿路径。</w:t>
-      </w:r>
-    </w:p>
-    <w:p>
-      <w:pPr>
-        <w:pStyle w:val="ListParagraph"/>
-        <w:keepNext w:val="false"/>
-        <w:keepLines/>
-        <w:widowControl/>
-        <w:numPr>
-          <w:ilvl w:val="0"/>
-          <w:numId w:val="1"/>
-        </w:numPr>
-        <w:spacing w:after="70" w:before="0" w:line="360"/>
-      </w:pPr>
-      <w:r>
-        <w:rPr>
-          <w:rFonts w:ascii="Microsoft YaHei" w:cs="Microsoft YaHei" w:eastAsia="Microsoft YaHei" w:hAnsi="Microsoft YaHei"/>
-          <w:b w:val="false"/>
-          <w:bCs w:val="false"/>
-          <w:i w:val="false"/>
-          <w:iCs w:val="false"/>
-          <w:color w:val="1F2937"/>
-          <w:sz w:val="21"/>
-          <w:szCs w:val="21"/>
-        </w:rPr>
-        <w:t xml:space="preserve">签名：L；本次角色为“成员 / 01 独立复核”，不是 G1、G3、G4 或 G8 的正式第二角色。</w:t>
+        <w:t xml:space="preserve">到 03 测量阶段后，你是本案的主要真实测评执行人。你需要亲自使用手机在豆包、通义千问、DeepSeek、腾讯元宝等消费级 AI App 中提问并保留用户真实可见结果。最终平台以冻结后的 platforms.csv 为准，不能拿网页端或 API 冒充手机 App。</w:t>
       </w:r>
     </w:p>
     <w:p>
@@ -1163,12 +1451,12 @@
           <w:sz w:val="21"/>
           <w:szCs w:val="21"/>
         </w:rPr>
-        <w:t xml:space="preserve">将复核意见交给 W。你不能代替 W 批准 G0。</w:t>
-      </w:r>
-    </w:p>
-    <w:p>
-      <w:pPr>
-        <w:pStyle w:val="Heading2"/>
+        <w:t xml:space="preserve">开始条件：必须先完成 G0、G1、G6、G7，并形成冻结包。现在仍在 G0 前，暂时不能开始手机采集。</w:t>
+      </w:r>
+    </w:p>
+    <w:p>
+      <w:pPr>
+        <w:pStyle w:val="Heading3"/>
         <w:keepNext/>
         <w:widowControl/>
         <w:spacing w:after="130" w:before="260"/>
@@ -1179,296 +1467,8 @@
           <w:b/>
           <w:bCs/>
           <w:color w:val="154C66"/>
-          <w:sz w:val="24"/>
-          <w:szCs w:val="24"/>
-        </w:rPr>
-        <w:t xml:space="preserve">5. 医疗与隐私边界</w:t>
-      </w:r>
-    </w:p>
-    <w:p>
-      <w:pPr>
-        <w:pStyle w:val="ListParagraph"/>
-        <w:keepNext w:val="false"/>
-        <w:keepLines/>
-        <w:widowControl/>
-        <w:numPr>
-          <w:ilvl w:val="0"/>
-          <w:numId w:val="1"/>
-        </w:numPr>
-        <w:spacing w:after="70" w:before="0" w:line="360"/>
-      </w:pPr>
-      <w:r>
-        <w:rPr>
-          <w:rFonts w:ascii="Microsoft YaHei" w:cs="Microsoft YaHei" w:eastAsia="Microsoft YaHei" w:hAnsi="Microsoft YaHei"/>
-          <w:b w:val="false"/>
-          <w:bCs w:val="false"/>
-          <w:i w:val="false"/>
-          <w:iCs w:val="false"/>
-          <w:color w:val="1F2937"/>
-          <w:sz w:val="21"/>
-          <w:szCs w:val="21"/>
-        </w:rPr>
-        <w:t xml:space="preserve">可以：提示症状可能对应多种风险，建议出现剧烈疼痛、血尿等警示时及时就医。</w:t>
-      </w:r>
-    </w:p>
-    <w:p>
-      <w:pPr>
-        <w:pStyle w:val="ListParagraph"/>
-        <w:keepNext w:val="false"/>
-        <w:keepLines/>
-        <w:widowControl/>
-        <w:numPr>
-          <w:ilvl w:val="0"/>
-          <w:numId w:val="1"/>
-        </w:numPr>
-        <w:spacing w:after="70" w:before="0" w:line="360"/>
-      </w:pPr>
-      <w:r>
-        <w:rPr>
-          <w:rFonts w:ascii="Microsoft YaHei" w:cs="Microsoft YaHei" w:eastAsia="Microsoft YaHei" w:hAnsi="Microsoft YaHei"/>
-          <w:b w:val="false"/>
-          <w:bCs w:val="false"/>
-          <w:i w:val="false"/>
-          <w:iCs w:val="false"/>
-          <w:color w:val="1F2937"/>
-          <w:sz w:val="21"/>
-          <w:szCs w:val="21"/>
-        </w:rPr>
-        <w:t xml:space="preserve">不可以：根据几项症状确认结石、给出具体治疗方案或替代医生诊断。</w:t>
-      </w:r>
-    </w:p>
-    <w:p>
-      <w:pPr>
-        <w:pStyle w:val="ListParagraph"/>
-        <w:keepNext w:val="false"/>
-        <w:keepLines/>
-        <w:widowControl/>
-        <w:numPr>
-          <w:ilvl w:val="0"/>
-          <w:numId w:val="1"/>
-        </w:numPr>
-        <w:spacing w:after="70" w:before="0" w:line="360"/>
-      </w:pPr>
-      <w:r>
-        <w:rPr>
-          <w:rFonts w:ascii="Microsoft YaHei" w:cs="Microsoft YaHei" w:eastAsia="Microsoft YaHei" w:hAnsi="Microsoft YaHei"/>
-          <w:b w:val="false"/>
-          <w:bCs w:val="false"/>
-          <w:i w:val="false"/>
-          <w:iCs w:val="false"/>
-          <w:color w:val="1F2937"/>
-          <w:sz w:val="21"/>
-          <w:szCs w:val="21"/>
-        </w:rPr>
-        <w:t xml:space="preserve">可以：用户主动说明所在地区并授权使用时，把地区作为观察条件。</w:t>
-      </w:r>
-    </w:p>
-    <w:p>
-      <w:pPr>
-        <w:pStyle w:val="ListParagraph"/>
-        <w:keepNext w:val="false"/>
-        <w:keepLines/>
-        <w:widowControl/>
-        <w:numPr>
-          <w:ilvl w:val="0"/>
-          <w:numId w:val="1"/>
-        </w:numPr>
-        <w:spacing w:after="70" w:before="0" w:line="360"/>
-      </w:pPr>
-      <w:r>
-        <w:rPr>
-          <w:rFonts w:ascii="Microsoft YaHei" w:cs="Microsoft YaHei" w:eastAsia="Microsoft YaHei" w:hAnsi="Microsoft YaHei"/>
-          <w:b w:val="false"/>
-          <w:bCs w:val="false"/>
-          <w:i w:val="false"/>
-          <w:iCs w:val="false"/>
-          <w:color w:val="1F2937"/>
-          <w:sz w:val="21"/>
-          <w:szCs w:val="21"/>
-        </w:rPr>
-        <w:t xml:space="preserve">不可以：后台读取、推断或长期保存精确地址。</w:t>
-      </w:r>
-    </w:p>
-    <w:p>
-      <w:pPr>
-        <w:pStyle w:val="ListParagraph"/>
-        <w:keepNext w:val="false"/>
-        <w:keepLines/>
-        <w:widowControl/>
-        <w:numPr>
-          <w:ilvl w:val="0"/>
-          <w:numId w:val="1"/>
-        </w:numPr>
-        <w:spacing w:after="70" w:before="0" w:line="360"/>
-      </w:pPr>
-      <w:r>
-        <w:rPr>
-          <w:rFonts w:ascii="Microsoft YaHei" w:cs="Microsoft YaHei" w:eastAsia="Microsoft YaHei" w:hAnsi="Microsoft YaHei"/>
-          <w:b w:val="false"/>
-          <w:bCs w:val="false"/>
-          <w:i w:val="false"/>
-          <w:iCs w:val="false"/>
-          <w:color w:val="1F2937"/>
-          <w:sz w:val="21"/>
-          <w:szCs w:val="21"/>
-        </w:rPr>
-        <w:t xml:space="preserve">当前地区判定：只有用户授权后主动明确说明“泉州南安”或“泉州市南安市”才满足第一阶段条件；仅说明“泉州”或位于泉州市其他区县，不纳入本阶段。</w:t>
-      </w:r>
-    </w:p>
-    <w:p>
-      <w:pPr>
-        <w:pStyle w:val="ListParagraph"/>
-        <w:keepNext w:val="false"/>
-        <w:keepLines/>
-        <w:widowControl/>
-        <w:numPr>
-          <w:ilvl w:val="0"/>
-          <w:numId w:val="1"/>
-        </w:numPr>
-        <w:spacing w:after="70" w:before="0" w:line="360"/>
-      </w:pPr>
-      <w:r>
-        <w:rPr>
-          <w:rFonts w:ascii="Microsoft YaHei" w:cs="Microsoft YaHei" w:eastAsia="Microsoft YaHei" w:hAnsi="Microsoft YaHei"/>
-          <w:b w:val="false"/>
-          <w:bCs w:val="false"/>
-          <w:i w:val="false"/>
-          <w:iCs w:val="false"/>
-          <w:color w:val="1F2937"/>
-          <w:sz w:val="21"/>
-          <w:szCs w:val="21"/>
-        </w:rPr>
-        <w:t xml:space="preserve">后续扩展：整个泉州市只能在另行批准后作为新阶段重新冻结，不能直接套用本阶段问法和结论。</w:t>
-      </w:r>
-    </w:p>
-    <w:p>
-      <w:pPr>
-        <w:pStyle w:val="ListParagraph"/>
-        <w:keepNext w:val="false"/>
-        <w:keepLines/>
-        <w:widowControl/>
-        <w:numPr>
-          <w:ilvl w:val="0"/>
-          <w:numId w:val="1"/>
-        </w:numPr>
-        <w:spacing w:after="70" w:before="0" w:line="360"/>
-      </w:pPr>
-      <w:r>
-        <w:rPr>
-          <w:rFonts w:ascii="Microsoft YaHei" w:cs="Microsoft YaHei" w:eastAsia="Microsoft YaHei" w:hAnsi="Microsoft YaHei"/>
-          <w:b w:val="false"/>
-          <w:bCs w:val="false"/>
-          <w:i w:val="false"/>
-          <w:iCs w:val="false"/>
-          <w:color w:val="1F2937"/>
-          <w:sz w:val="21"/>
-          <w:szCs w:val="21"/>
-        </w:rPr>
-        <w:t xml:space="preserve">可以：测量目标机构是否被正确提及。</w:t>
-      </w:r>
-    </w:p>
-    <w:p>
-      <w:pPr>
-        <w:pStyle w:val="ListParagraph"/>
-        <w:keepNext w:val="false"/>
-        <w:keepLines/>
-        <w:widowControl/>
-        <w:numPr>
-          <w:ilvl w:val="0"/>
-          <w:numId w:val="1"/>
-        </w:numPr>
-        <w:spacing w:after="70" w:before="0" w:line="360"/>
-      </w:pPr>
-      <w:r>
-        <w:rPr>
-          <w:rFonts w:ascii="Microsoft YaHei" w:cs="Microsoft YaHei" w:eastAsia="Microsoft YaHei" w:hAnsi="Microsoft YaHei"/>
-          <w:b w:val="false"/>
-          <w:bCs w:val="false"/>
-          <w:i w:val="false"/>
-          <w:iCs w:val="false"/>
-          <w:color w:val="1F2937"/>
-          <w:sz w:val="21"/>
-          <w:szCs w:val="21"/>
-        </w:rPr>
-        <w:t xml:space="preserve">不可以：承诺推荐目标医院、保证排名、保证导诊或报名增长。</w:t>
-      </w:r>
-    </w:p>
-    <w:p>
-      <w:pPr>
-        <w:pStyle w:val="Heading2"/>
-        <w:keepNext/>
-        <w:widowControl/>
-        <w:spacing w:after="130" w:before="260"/>
-      </w:pPr>
-      <w:r>
-        <w:rPr>
-          <w:rFonts w:ascii="Microsoft YaHei" w:cs="Microsoft YaHei" w:eastAsia="Microsoft YaHei" w:hAnsi="Microsoft YaHei"/>
-          <w:b/>
-          <w:bCs/>
-          <w:color w:val="154C66"/>
-          <w:sz w:val="24"/>
-          <w:szCs w:val="24"/>
-        </w:rPr>
-        <w:t xml:space="preserve">6. 你的核心岗位：真实手机 App 测量操作员</w:t>
-      </w:r>
-    </w:p>
-    <w:p>
-      <w:pPr>
-        <w:keepNext w:val="false"/>
-        <w:keepLines/>
-        <w:widowControl/>
-        <w:spacing w:after="120" w:before="0" w:line="360"/>
-      </w:pPr>
-      <w:r>
-        <w:rPr>
-          <w:rFonts w:ascii="Microsoft YaHei" w:cs="Microsoft YaHei" w:eastAsia="Microsoft YaHei" w:hAnsi="Microsoft YaHei"/>
-          <w:b w:val="false"/>
-          <w:bCs w:val="false"/>
-          <w:i w:val="false"/>
-          <w:iCs w:val="false"/>
-          <w:color w:val="1F2937"/>
-          <w:sz w:val="21"/>
-          <w:szCs w:val="21"/>
-        </w:rPr>
-        <w:t xml:space="preserve">到 03 测量阶段后，你是本案的主要真实测评执行人。你需要亲自使用手机在豆包、通义千问、DeepSeek、腾讯元宝等消费级 AI App 中提问并保留用户真实可见结果。最终平台以冻结后的 platforms.csv 为准，不能拿网页端或 API 冒充手机 App。</w:t>
-      </w:r>
-    </w:p>
-    <w:p>
-      <w:pPr>
-        <w:keepNext w:val="false"/>
-        <w:keepLines/>
-        <w:widowControl/>
-        <w:spacing w:after="120" w:before="0" w:line="360"/>
-      </w:pPr>
-      <w:r>
-        <w:rPr>
-          <w:rFonts w:ascii="Microsoft YaHei" w:cs="Microsoft YaHei" w:eastAsia="Microsoft YaHei" w:hAnsi="Microsoft YaHei"/>
-          <w:b w:val="false"/>
-          <w:bCs w:val="false"/>
-          <w:i w:val="false"/>
-          <w:iCs w:val="false"/>
-          <w:color w:val="1F2937"/>
-          <w:sz w:val="21"/>
-          <w:szCs w:val="21"/>
-        </w:rPr>
-        <w:t xml:space="preserve">开始条件：必须先完成 G0、G1、G6、G7，并形成冻结包。现在仍在 G0 前，暂时不能开始手机采集。</w:t>
-      </w:r>
-    </w:p>
-    <w:p>
-      <w:pPr>
-        <w:pStyle w:val="Heading3"/>
-        <w:keepNext/>
-        <w:widowControl/>
-        <w:spacing w:after="130" w:before="260"/>
-      </w:pPr>
-      <w:r>
-        <w:rPr>
-          <w:rFonts w:ascii="Microsoft YaHei" w:cs="Microsoft YaHei" w:eastAsia="Microsoft YaHei" w:hAnsi="Microsoft YaHei"/>
-          <w:b/>
-          <w:bCs/>
-          <w:color w:val="154C66"/>
-          <w:sz w:val="24"/>
-          <w:szCs w:val="24"/>
+          <w:sz w:val="22"/>
+          <w:szCs w:val="22"/>
         </w:rPr>
         <w:t xml:space="preserve">每个样本的标准动作</w:t>
       </w:r>
@@ -1496,7 +1496,7 @@
           <w:sz w:val="21"/>
           <w:szCs w:val="21"/>
         </w:rPr>
-        <w:t xml:space="preserve">核对当天清单中的城市必须为泉州市南安市，并核对手机、测试账号、App 版本和产品模式。</w:t>
+        <w:t xml:space="preserve">核对当天清单中的城市必须为泉州南安，并核对手机、测试账号、App 版本和产品模式。</w:t>
       </w:r>
     </w:p>
     <w:p>
@@ -3522,7 +3522,7 @@
           <w:sz w:val="21"/>
           <w:szCs w:val="21"/>
         </w:rPr>
-        <w:t xml:space="preserve">[ ] 能说明“泉州市南安市”与“整个泉州市”的范围差异，并检查只说“泉州”时不进入本阶段。</w:t>
+        <w:t xml:space="preserve">[ ] 能说明“泉州南安”与“整个泉州”的范围差异，并检查只说“泉州”时不进入本阶段。</w:t>
       </w:r>
     </w:p>
     <w:p>
@@ -3811,7 +3811,7 @@
           <w:sz w:val="21"/>
           <w:szCs w:val="21"/>
         </w:rPr>
-        <w:t xml:space="preserve">我已阅读当前 01 节点材料，知道本案只做诊断，不保证推荐，不把症状当作确诊，不擅自读取位置；第一阶段只覆盖泉州市南安市，仅说“泉州”不纳入。我将在各阶段承担分配给 L 的执行任务，并在 03 阶段亲自使用真实手机完成 App 冷会话采集；由 W 独立评分和验收。在 G0 通过前，我不会提前采集或进入下一阶段。</w:t>
+        <w:t xml:space="preserve">我已阅读当前 01 节点材料，知道本案只做诊断，不保证推荐，不把症状当作确诊，不擅自读取位置；第一阶段只覆盖泉州南安，仅说“泉州”不纳入。我将在各阶段承担分配给 L 的执行任务，并在 03 阶段亲自使用真实手机完成 App 冷会话采集；由 W 独立评分和验收。在 G0 通过前，我不会提前采集或进入下一阶段。</w:t>
       </w:r>
     </w:p>
     <w:p>
@@ -4290,25 +4290,13 @@
       <w:szCs w:val="20"/>
     </w:rPr>
   </w:style>
-  <w:style w:type="paragraph" w:styleId="Title">
-    <w:name w:val="Title"/>
-    <w:basedOn w:val="Normal"/>
-    <w:next w:val="Normal"/>
-    <w:rPr>
-      <w:rFonts w:ascii="Microsoft YaHei" w:cs="Microsoft YaHei" w:eastAsia="Microsoft YaHei" w:hAnsi="Microsoft YaHei"/>
-      <w:b/>
-      <w:bCs/>
-      <w:color w:val="0F3D56"/>
-      <w:sz w:val="34"/>
-      <w:szCs w:val="34"/>
-    </w:rPr>
-  </w:style>
   <w:style w:type="paragraph" w:styleId="Heading1">
     <w:name w:val="Heading 1"/>
     <w:basedOn w:val="Normal"/>
     <w:next w:val="Normal"/>
     <w:pPr>
       <w:keepNext/>
+      <w:outlineLvl w:val="0"/>
     </w:pPr>
     <w:rPr>
       <w:rFonts w:ascii="Microsoft YaHei" w:cs="Microsoft YaHei" w:eastAsia="Microsoft YaHei" w:hAnsi="Microsoft YaHei"/>
@@ -4325,6 +4313,7 @@
     <w:next w:val="Normal"/>
     <w:pPr>
       <w:keepNext/>
+      <w:outlineLvl w:val="1"/>
     </w:pPr>
     <w:rPr>
       <w:rFonts w:ascii="Microsoft YaHei" w:cs="Microsoft YaHei" w:eastAsia="Microsoft YaHei" w:hAnsi="Microsoft YaHei"/>
@@ -4341,6 +4330,7 @@
     <w:next w:val="Normal"/>
     <w:pPr>
       <w:keepNext/>
+      <w:outlineLvl w:val="2"/>
     </w:pPr>
     <w:rPr>
       <w:rFonts w:ascii="Microsoft YaHei" w:cs="Microsoft YaHei" w:eastAsia="Microsoft YaHei" w:hAnsi="Microsoft YaHei"/>

</xml_diff>

<commit_message>
feat: close G0 and start requirements freeze
</commit_message>
<xml_diff>
--- a/binhai-hospital-geo-diagnosis/working-documents/全阶段_审核成员项目协作交接手册_2026-08-23.docx
+++ b/binhai-hospital-geo-diagnosis/working-documents/全阶段_审核成员项目协作交接手册_2026-08-23.docx
@@ -71,7 +71,7 @@
           <w:sz w:val="21"/>
           <w:szCs w:val="21"/>
         </w:rPr>
-        <w:t xml:space="preserve">文档状态：工作草稿，G0 前</w:t>
+        <w:t xml:space="preserve">文档状态：G0 已通过，02 需求冻结中</w:t>
       </w:r>
     </w:p>
     <w:p>
@@ -261,59 +261,59 @@
           <w:sz w:val="21"/>
           <w:szCs w:val="21"/>
         </w:rPr>
-        <w:t xml:space="preserve">当前阶段：01 客户初次洽谈。</w:t>
-      </w:r>
-    </w:p>
-    <w:p>
-      <w:pPr>
-        <w:pStyle w:val="ListParagraph"/>
-        <w:keepNext w:val="false"/>
-        <w:keepLines/>
-        <w:widowControl/>
-        <w:numPr>
-          <w:ilvl w:val="0"/>
-          <w:numId w:val="1"/>
-        </w:numPr>
-        <w:spacing w:after="70" w:before="0" w:line="360"/>
-      </w:pPr>
-      <w:r>
-        <w:rPr>
-          <w:rFonts w:ascii="Microsoft YaHei" w:cs="Microsoft YaHei" w:eastAsia="Microsoft YaHei" w:hAnsi="Microsoft YaHei"/>
-          <w:b w:val="false"/>
-          <w:bCs w:val="false"/>
-          <w:i w:val="false"/>
-          <w:iCs w:val="false"/>
-          <w:color w:val="1F2937"/>
-          <w:sz w:val="21"/>
-          <w:szCs w:val="21"/>
-        </w:rPr>
-        <w:t xml:space="preserve">当前门：G0 前，尚未批准。</w:t>
-      </w:r>
-    </w:p>
-    <w:p>
-      <w:pPr>
-        <w:pStyle w:val="ListParagraph"/>
-        <w:keepNext w:val="false"/>
-        <w:keepLines/>
-        <w:widowControl/>
-        <w:numPr>
-          <w:ilvl w:val="0"/>
-          <w:numId w:val="1"/>
-        </w:numPr>
-        <w:spacing w:after="70" w:before="0" w:line="360"/>
-      </w:pPr>
-      <w:r>
-        <w:rPr>
-          <w:rFonts w:ascii="Microsoft YaHei" w:cs="Microsoft YaHei" w:eastAsia="Microsoft YaHei" w:hAnsi="Microsoft YaHei"/>
-          <w:b w:val="false"/>
-          <w:bCs w:val="false"/>
-          <w:i w:val="false"/>
-          <w:iCs w:val="false"/>
-          <w:color w:val="1F2937"/>
-          <w:sz w:val="21"/>
-          <w:szCs w:val="21"/>
-        </w:rPr>
-        <w:t xml:space="preserve">已有材料：更新后的 R0001 客户原话截图、R0002 逐字转录、R0003 客户需求要点、R0004 W 范围确认，以及修订后的商机卡和范围边界草稿。</w:t>
+        <w:t xml:space="preserve">当前阶段：02 需求冻结。</w:t>
+      </w:r>
+    </w:p>
+    <w:p>
+      <w:pPr>
+        <w:pStyle w:val="ListParagraph"/>
+        <w:keepNext w:val="false"/>
+        <w:keepLines/>
+        <w:widowControl/>
+        <w:numPr>
+          <w:ilvl w:val="0"/>
+          <w:numId w:val="1"/>
+        </w:numPr>
+        <w:spacing w:after="70" w:before="0" w:line="360"/>
+      </w:pPr>
+      <w:r>
+        <w:rPr>
+          <w:rFonts w:ascii="Microsoft YaHei" w:cs="Microsoft YaHei" w:eastAsia="Microsoft YaHei" w:hAnsi="Microsoft YaHei"/>
+          <w:b w:val="false"/>
+          <w:bCs w:val="false"/>
+          <w:i w:val="false"/>
+          <w:iCs w:val="false"/>
+          <w:color w:val="1F2937"/>
+          <w:sz w:val="21"/>
+          <w:szCs w:val="21"/>
+        </w:rPr>
+        <w:t xml:space="preserve">当前门：G1 前。</w:t>
+      </w:r>
+    </w:p>
+    <w:p>
+      <w:pPr>
+        <w:pStyle w:val="ListParagraph"/>
+        <w:keepNext w:val="false"/>
+        <w:keepLines/>
+        <w:widowControl/>
+        <w:numPr>
+          <w:ilvl w:val="0"/>
+          <w:numId w:val="1"/>
+        </w:numPr>
+        <w:spacing w:after="70" w:before="0" w:line="360"/>
+      </w:pPr>
+      <w:r>
+        <w:rPr>
+          <w:rFonts w:ascii="Microsoft YaHei" w:cs="Microsoft YaHei" w:eastAsia="Microsoft YaHei" w:hAnsi="Microsoft YaHei"/>
+          <w:b w:val="false"/>
+          <w:bCs w:val="false"/>
+          <w:i w:val="false"/>
+          <w:iCs w:val="false"/>
+          <w:color w:val="1F2937"/>
+          <w:sz w:val="21"/>
+          <w:szCs w:val="21"/>
+        </w:rPr>
+        <w:t xml:space="preserve">已有材料：R0001—R0004 客户与范围依据、R0008 审核通过回传、G0 负责人批准记录，以及 02 需求冻结启动清单。</w:t>
       </w:r>
     </w:p>
     <w:p>
@@ -365,33 +365,33 @@
           <w:sz w:val="21"/>
           <w:szCs w:val="21"/>
         </w:rPr>
-        <w:t xml:space="preserve">当前阻塞：R0001—R0003 已更新，L 必须基于更新材料重新独立审核。</w:t>
-      </w:r>
-    </w:p>
-    <w:p>
-      <w:pPr>
-        <w:pStyle w:val="ListParagraph"/>
-        <w:keepNext w:val="false"/>
-        <w:keepLines/>
-        <w:widowControl/>
-        <w:numPr>
-          <w:ilvl w:val="0"/>
-          <w:numId w:val="1"/>
-        </w:numPr>
-        <w:spacing w:after="70" w:before="0" w:line="360"/>
-      </w:pPr>
-      <w:r>
-        <w:rPr>
-          <w:rFonts w:ascii="Microsoft YaHei" w:cs="Microsoft YaHei" w:eastAsia="Microsoft YaHei" w:hAnsi="Microsoft YaHei"/>
-          <w:b w:val="false"/>
-          <w:bCs w:val="false"/>
-          <w:i w:val="false"/>
-          <w:iCs w:val="false"/>
-          <w:color w:val="1F2937"/>
-          <w:sz w:val="21"/>
-          <w:szCs w:val="21"/>
-        </w:rPr>
-        <w:t xml:space="preserve">你现在不能做：进入 02、设计问法、开始 App 采集、修改页面或声称有改善效果。</w:t>
+        <w:t xml:space="preserve">当前等待：W 补充机构官方事实、P0 平台和测评预算范围；Agent 随后起草 02 冻结材料。</w:t>
+      </w:r>
+    </w:p>
+    <w:p>
+      <w:pPr>
+        <w:pStyle w:val="ListParagraph"/>
+        <w:keepNext w:val="false"/>
+        <w:keepLines/>
+        <w:widowControl/>
+        <w:numPr>
+          <w:ilvl w:val="0"/>
+          <w:numId w:val="1"/>
+        </w:numPr>
+        <w:spacing w:after="70" w:before="0" w:line="360"/>
+      </w:pPr>
+      <w:r>
+        <w:rPr>
+          <w:rFonts w:ascii="Microsoft YaHei" w:cs="Microsoft YaHei" w:eastAsia="Microsoft YaHei" w:hAnsi="Microsoft YaHei"/>
+          <w:b w:val="false"/>
+          <w:bCs w:val="false"/>
+          <w:i w:val="false"/>
+          <w:iCs w:val="false"/>
+          <w:color w:val="1F2937"/>
+          <w:sz w:val="21"/>
+          <w:szCs w:val="21"/>
+        </w:rPr>
+        <w:t xml:space="preserve">你现在不能做：开始 App 采集、修改页面或声称有改善效果。你可以在收到 02 草稿后开始 G1 独立审核。</w:t>
       </w:r>
     </w:p>
     <w:p>
@@ -526,28 +526,7 @@
           <w:sz w:val="22"/>
           <w:szCs w:val="22"/>
         </w:rPr>
-        <w:t xml:space="preserve">第一步：阅读</w:t>
-      </w:r>
-    </w:p>
-    <w:p>
-      <w:pPr>
-        <w:keepNext w:val="false"/>
-        <w:keepLines/>
-        <w:widowControl/>
-        <w:spacing w:after="120" w:before="0" w:line="360"/>
-      </w:pPr>
-      <w:r>
-        <w:rPr>
-          <w:rFonts w:ascii="Microsoft YaHei" w:cs="Microsoft YaHei" w:eastAsia="Microsoft YaHei" w:hAnsi="Microsoft YaHei"/>
-          <w:b w:val="false"/>
-          <w:bCs w:val="false"/>
-          <w:i w:val="false"/>
-          <w:iCs w:val="false"/>
-          <w:color w:val="1F2937"/>
-          <w:sz w:val="21"/>
-          <w:szCs w:val="21"/>
-        </w:rPr>
-        <w:t xml:space="preserve">按顺序阅读：</w:t>
+        <w:t xml:space="preserve">当前先阅读</w:t>
       </w:r>
     </w:p>
     <w:p>
@@ -573,7 +552,7 @@
           <w:sz w:val="21"/>
           <w:szCs w:val="21"/>
         </w:rPr>
-        <w:t xml:space="preserve">README.md</w:t>
+        <w:t xml:space="preserve">project-records/01_G0负责人批准记录_2026-08-23.md</w:t>
       </w:r>
     </w:p>
     <w:p>
@@ -599,7 +578,7 @@
           <w:sz w:val="21"/>
           <w:szCs w:val="21"/>
         </w:rPr>
-        <w:t xml:space="preserve">source-materials/current/R0001_客户原始需求截图_2026-08-21.png（R0001）</w:t>
+        <w:t xml:space="preserve">source-materials/review-history/R0008_审核成员地域口径重审通过回传_2026-08-23.md</w:t>
       </w:r>
     </w:p>
     <w:p>
@@ -625,158 +604,7 @@
           <w:sz w:val="21"/>
           <w:szCs w:val="21"/>
         </w:rPr>
-        <w:t xml:space="preserve">source-materials/current/R0002_客户原始需求逐字转录_2026-08-21.md（R0002）</w:t>
-      </w:r>
-    </w:p>
-    <w:p>
-      <w:pPr>
-        <w:pStyle w:val="ListParagraph"/>
-        <w:keepNext w:val="false"/>
-        <w:keepLines/>
-        <w:widowControl/>
-        <w:numPr>
-          <w:ilvl w:val="0"/>
-          <w:numId w:val="2"/>
-        </w:numPr>
-        <w:spacing w:after="70" w:before="0" w:line="360"/>
-      </w:pPr>
-      <w:r>
-        <w:rPr>
-          <w:rFonts w:ascii="Microsoft YaHei" w:cs="Microsoft YaHei" w:eastAsia="Microsoft YaHei" w:hAnsi="Microsoft YaHei"/>
-          <w:b w:val="false"/>
-          <w:bCs w:val="false"/>
-          <w:i w:val="false"/>
-          <w:iCs w:val="false"/>
-          <w:color w:val="1F2937"/>
-          <w:sz w:val="21"/>
-          <w:szCs w:val="21"/>
-        </w:rPr>
-        <w:t xml:space="preserve">source-materials/current/R0003_客户需求要点与地域口径_2026-08-23.md（R0003）</w:t>
-      </w:r>
-    </w:p>
-    <w:p>
-      <w:pPr>
-        <w:pStyle w:val="ListParagraph"/>
-        <w:keepNext w:val="false"/>
-        <w:keepLines/>
-        <w:widowControl/>
-        <w:numPr>
-          <w:ilvl w:val="0"/>
-          <w:numId w:val="2"/>
-        </w:numPr>
-        <w:spacing w:after="70" w:before="0" w:line="360"/>
-      </w:pPr>
-      <w:r>
-        <w:rPr>
-          <w:rFonts w:ascii="Microsoft YaHei" w:cs="Microsoft YaHei" w:eastAsia="Microsoft YaHei" w:hAnsi="Microsoft YaHei"/>
-          <w:b w:val="false"/>
-          <w:bCs w:val="false"/>
-          <w:i w:val="false"/>
-          <w:iCs w:val="false"/>
-          <w:color w:val="1F2937"/>
-          <w:sz w:val="21"/>
-          <w:szCs w:val="21"/>
-        </w:rPr>
-        <w:t xml:space="preserve">source-materials/current/R0004_负责人诊断范围与禁售确认_2026-08-23.md（R0004）</w:t>
-      </w:r>
-    </w:p>
-    <w:p>
-      <w:pPr>
-        <w:pStyle w:val="ListParagraph"/>
-        <w:keepNext w:val="false"/>
-        <w:keepLines/>
-        <w:widowControl/>
-        <w:numPr>
-          <w:ilvl w:val="0"/>
-          <w:numId w:val="2"/>
-        </w:numPr>
-        <w:spacing w:after="70" w:before="0" w:line="360"/>
-      </w:pPr>
-      <w:r>
-        <w:rPr>
-          <w:rFonts w:ascii="Microsoft YaHei" w:cs="Microsoft YaHei" w:eastAsia="Microsoft YaHei" w:hAnsi="Microsoft YaHei"/>
-          <w:b w:val="false"/>
-          <w:bCs w:val="false"/>
-          <w:i w:val="false"/>
-          <w:iCs w:val="false"/>
-          <w:color w:val="1F2937"/>
-          <w:sz w:val="21"/>
-          <w:szCs w:val="21"/>
-        </w:rPr>
-        <w:t xml:space="preserve">working-documents/01_商机信息卡_G0前草稿_2026-08-23.md</w:t>
-      </w:r>
-    </w:p>
-    <w:p>
-      <w:pPr>
-        <w:pStyle w:val="ListParagraph"/>
-        <w:keepNext w:val="false"/>
-        <w:keepLines/>
-        <w:widowControl/>
-        <w:numPr>
-          <w:ilvl w:val="0"/>
-          <w:numId w:val="2"/>
-        </w:numPr>
-        <w:spacing w:after="70" w:before="0" w:line="360"/>
-      </w:pPr>
-      <w:r>
-        <w:rPr>
-          <w:rFonts w:ascii="Microsoft YaHei" w:cs="Microsoft YaHei" w:eastAsia="Microsoft YaHei" w:hAnsi="Microsoft YaHei"/>
-          <w:b w:val="false"/>
-          <w:bCs w:val="false"/>
-          <w:i w:val="false"/>
-          <w:iCs w:val="false"/>
-          <w:color w:val="1F2937"/>
-          <w:sz w:val="21"/>
-          <w:szCs w:val="21"/>
-        </w:rPr>
-        <w:t xml:space="preserve">working-documents/01_项目范围边界_G0前草稿_2026-08-23.md</w:t>
-      </w:r>
-    </w:p>
-    <w:p>
-      <w:pPr>
-        <w:pStyle w:val="ListParagraph"/>
-        <w:keepNext w:val="false"/>
-        <w:keepLines/>
-        <w:widowControl/>
-        <w:numPr>
-          <w:ilvl w:val="0"/>
-          <w:numId w:val="2"/>
-        </w:numPr>
-        <w:spacing w:after="70" w:before="0" w:line="360"/>
-      </w:pPr>
-      <w:r>
-        <w:rPr>
-          <w:rFonts w:ascii="Microsoft YaHei" w:cs="Microsoft YaHei" w:eastAsia="Microsoft YaHei" w:hAnsi="Microsoft YaHei"/>
-          <w:b w:val="false"/>
-          <w:bCs w:val="false"/>
-          <w:i w:val="false"/>
-          <w:iCs w:val="false"/>
-          <w:color w:val="1F2937"/>
-          <w:sz w:val="21"/>
-          <w:szCs w:val="21"/>
-        </w:rPr>
-        <w:t xml:space="preserve">working-documents/01_审核成员地域口径更新重审任务单_2026-08-23.md</w:t>
-      </w:r>
-    </w:p>
-    <w:p>
-      <w:pPr>
-        <w:keepNext w:val="false"/>
-        <w:keepLines/>
-        <w:widowControl/>
-        <w:spacing w:after="120" w:before="0" w:line="360"/>
-      </w:pPr>
-      <w:r>
-        <w:rPr>
-          <w:rFonts w:ascii="Microsoft YaHei" w:cs="Microsoft YaHei" w:eastAsia="Microsoft YaHei" w:hAnsi="Microsoft YaHei"/>
-          <w:b w:val="false"/>
-          <w:bCs w:val="false"/>
-          <w:i w:val="false"/>
-          <w:iCs w:val="false"/>
-          <w:color w:val="1F2937"/>
-          <w:sz w:val="21"/>
-          <w:szCs w:val="21"/>
-        </w:rPr>
-        <w:t xml:space="preserve">R0001 是客户原话图像金标准，R0002 是逐字转录，R0003 是要点索引；R0004 是 W 的内部范围确认，不是客户原话。</w:t>
+        <w:t xml:space="preserve">working-documents/02_需求冻结启动清单_G1前草稿_2026-08-23.md</w:t>
       </w:r>
     </w:p>
     <w:p>
@@ -795,184 +623,163 @@
           <w:sz w:val="22"/>
           <w:szCs w:val="22"/>
         </w:rPr>
-        <w:t xml:space="preserve">第二步：独立质检</w:t>
-      </w:r>
-    </w:p>
-    <w:p>
-      <w:pPr>
-        <w:keepNext w:val="false"/>
-        <w:keepLines/>
-        <w:widowControl/>
-        <w:spacing w:after="120" w:before="0" w:line="360"/>
-      </w:pPr>
-      <w:r>
-        <w:rPr>
-          <w:rFonts w:ascii="Microsoft YaHei" w:cs="Microsoft YaHei" w:eastAsia="Microsoft YaHei" w:hAnsi="Microsoft YaHei"/>
-          <w:b w:val="false"/>
-          <w:bCs w:val="false"/>
-          <w:i w:val="false"/>
-          <w:iCs w:val="false"/>
-          <w:color w:val="1F2937"/>
-          <w:sz w:val="21"/>
-          <w:szCs w:val="21"/>
-        </w:rPr>
-        <w:t xml:space="preserve">不要先问 W “标准答案”。独立检查：</w:t>
-      </w:r>
-    </w:p>
-    <w:p>
-      <w:pPr>
-        <w:pStyle w:val="ListParagraph"/>
-        <w:keepNext w:val="false"/>
-        <w:keepLines/>
-        <w:widowControl/>
-        <w:numPr>
-          <w:ilvl w:val="0"/>
-          <w:numId w:val="1"/>
-        </w:numPr>
-        <w:spacing w:after="70" w:before="0" w:line="360"/>
-      </w:pPr>
-      <w:r>
-        <w:rPr>
-          <w:rFonts w:ascii="Microsoft YaHei" w:cs="Microsoft YaHei" w:eastAsia="Microsoft YaHei" w:hAnsi="Microsoft YaHei"/>
-          <w:b w:val="false"/>
-          <w:bCs w:val="false"/>
-          <w:i w:val="false"/>
-          <w:iCs w:val="false"/>
-          <w:color w:val="1F2937"/>
-          <w:sz w:val="21"/>
-          <w:szCs w:val="21"/>
-        </w:rPr>
-        <w:t xml:space="preserve">完整：客户原话中的城市与需求是否齐全；第一阶段是否明确只覆盖泉州南安；客户代号、产品线和禁售确认是否有清楚的内部来源。</w:t>
-      </w:r>
-    </w:p>
-    <w:p>
-      <w:pPr>
-        <w:pStyle w:val="ListParagraph"/>
-        <w:keepNext w:val="false"/>
-        <w:keepLines/>
-        <w:widowControl/>
-        <w:numPr>
-          <w:ilvl w:val="0"/>
-          <w:numId w:val="1"/>
-        </w:numPr>
-        <w:spacing w:after="70" w:before="0" w:line="360"/>
-      </w:pPr>
-      <w:r>
-        <w:rPr>
-          <w:rFonts w:ascii="Microsoft YaHei" w:cs="Microsoft YaHei" w:eastAsia="Microsoft YaHei" w:hAnsi="Microsoft YaHei"/>
-          <w:b w:val="false"/>
-          <w:bCs w:val="false"/>
-          <w:i w:val="false"/>
-          <w:iCs w:val="false"/>
-          <w:color w:val="1F2937"/>
-          <w:sz w:val="21"/>
-          <w:szCs w:val="21"/>
-        </w:rPr>
-        <w:t xml:space="preserve">正确：是否把“可能风险”写成“确认结石”，是否保证推荐。</w:t>
-      </w:r>
-    </w:p>
-    <w:p>
-      <w:pPr>
-        <w:pStyle w:val="ListParagraph"/>
-        <w:keepNext w:val="false"/>
-        <w:keepLines/>
-        <w:widowControl/>
-        <w:numPr>
-          <w:ilvl w:val="0"/>
-          <w:numId w:val="1"/>
-        </w:numPr>
-        <w:spacing w:after="70" w:before="0" w:line="360"/>
-      </w:pPr>
-      <w:r>
-        <w:rPr>
-          <w:rFonts w:ascii="Microsoft YaHei" w:cs="Microsoft YaHei" w:eastAsia="Microsoft YaHei" w:hAnsi="Microsoft YaHei"/>
-          <w:b w:val="false"/>
-          <w:bCs w:val="false"/>
-          <w:i w:val="false"/>
-          <w:iCs w:val="false"/>
-          <w:color w:val="1F2937"/>
-          <w:sz w:val="21"/>
-          <w:szCs w:val="21"/>
-        </w:rPr>
-        <w:t xml:space="preserve">一致：是否始终只有“诊断”一条产品线。</w:t>
-      </w:r>
-    </w:p>
-    <w:p>
-      <w:pPr>
-        <w:pStyle w:val="ListParagraph"/>
-        <w:keepNext w:val="false"/>
-        <w:keepLines/>
-        <w:widowControl/>
-        <w:numPr>
-          <w:ilvl w:val="0"/>
-          <w:numId w:val="1"/>
-        </w:numPr>
-        <w:spacing w:after="70" w:before="0" w:line="360"/>
-      </w:pPr>
-      <w:r>
-        <w:rPr>
-          <w:rFonts w:ascii="Microsoft YaHei" w:cs="Microsoft YaHei" w:eastAsia="Microsoft YaHei" w:hAnsi="Microsoft YaHei"/>
-          <w:b w:val="false"/>
-          <w:bCs w:val="false"/>
-          <w:i w:val="false"/>
-          <w:iCs w:val="false"/>
-          <w:color w:val="1F2937"/>
-          <w:sz w:val="21"/>
-          <w:szCs w:val="21"/>
-        </w:rPr>
-        <w:t xml:space="preserve">可追溯：每条客户事实是否回到 R0001—R0003；内部设置是否回到 W / R0004，二者不得混写。</w:t>
-      </w:r>
-    </w:p>
-    <w:p>
-      <w:pPr>
-        <w:pStyle w:val="ListParagraph"/>
-        <w:keepNext w:val="false"/>
-        <w:keepLines/>
-        <w:widowControl/>
-        <w:numPr>
-          <w:ilvl w:val="0"/>
-          <w:numId w:val="1"/>
-        </w:numPr>
-        <w:spacing w:after="70" w:before="0" w:line="360"/>
-      </w:pPr>
-      <w:r>
-        <w:rPr>
-          <w:rFonts w:ascii="Microsoft YaHei" w:cs="Microsoft YaHei" w:eastAsia="Microsoft YaHei" w:hAnsi="Microsoft YaHei"/>
-          <w:b w:val="false"/>
-          <w:bCs w:val="false"/>
-          <w:i w:val="false"/>
-          <w:iCs w:val="false"/>
-          <w:color w:val="1F2937"/>
-          <w:sz w:val="21"/>
-          <w:szCs w:val="21"/>
-        </w:rPr>
-        <w:t xml:space="preserve">可执行：是否需要读取未经授权的位置，是否超出医疗合规边界。</w:t>
-      </w:r>
-    </w:p>
-    <w:p>
-      <w:pPr>
-        <w:pStyle w:val="ListParagraph"/>
-        <w:keepNext w:val="false"/>
-        <w:keepLines/>
-        <w:widowControl/>
-        <w:numPr>
-          <w:ilvl w:val="0"/>
-          <w:numId w:val="1"/>
-        </w:numPr>
-        <w:spacing w:after="70" w:before="0" w:line="360"/>
-      </w:pPr>
-      <w:r>
-        <w:rPr>
-          <w:rFonts w:ascii="Microsoft YaHei" w:cs="Microsoft YaHei" w:eastAsia="Microsoft YaHei" w:hAnsi="Microsoft YaHei"/>
-          <w:b w:val="false"/>
-          <w:bCs w:val="false"/>
-          <w:i w:val="false"/>
-          <w:iCs w:val="false"/>
-          <w:color w:val="1F2937"/>
-          <w:sz w:val="21"/>
-          <w:szCs w:val="21"/>
-        </w:rPr>
-        <w:t xml:space="preserve">地域准确：是否把仅说明“泉州”的用户或泉州其他地区错误纳入泉州南安范围。</w:t>
+        <w:t xml:space="preserve">收到 02 草稿后独立审核</w:t>
+      </w:r>
+    </w:p>
+    <w:p>
+      <w:pPr>
+        <w:pStyle w:val="ListParagraph"/>
+        <w:keepNext w:val="false"/>
+        <w:keepLines/>
+        <w:widowControl/>
+        <w:numPr>
+          <w:ilvl w:val="0"/>
+          <w:numId w:val="1"/>
+        </w:numPr>
+        <w:spacing w:after="70" w:before="0" w:line="360"/>
+      </w:pPr>
+      <w:r>
+        <w:rPr>
+          <w:rFonts w:ascii="Microsoft YaHei" w:cs="Microsoft YaHei" w:eastAsia="Microsoft YaHei" w:hAnsi="Microsoft YaHei"/>
+          <w:b w:val="false"/>
+          <w:bCs w:val="false"/>
+          <w:i w:val="false"/>
+          <w:iCs w:val="false"/>
+          <w:color w:val="1F2937"/>
+          <w:sz w:val="21"/>
+          <w:szCs w:val="21"/>
+        </w:rPr>
+        <w:t xml:space="preserve">主终点是否仍为无品牌发现问上的正确提及概率。</w:t>
+      </w:r>
+    </w:p>
+    <w:p>
+      <w:pPr>
+        <w:pStyle w:val="ListParagraph"/>
+        <w:keepNext w:val="false"/>
+        <w:keepLines/>
+        <w:widowControl/>
+        <w:numPr>
+          <w:ilvl w:val="0"/>
+          <w:numId w:val="1"/>
+        </w:numPr>
+        <w:spacing w:after="70" w:before="0" w:line="360"/>
+      </w:pPr>
+      <w:r>
+        <w:rPr>
+          <w:rFonts w:ascii="Microsoft YaHei" w:cs="Microsoft YaHei" w:eastAsia="Microsoft YaHei" w:hAnsi="Microsoft YaHei"/>
+          <w:b w:val="false"/>
+          <w:bCs w:val="false"/>
+          <w:i w:val="false"/>
+          <w:iCs w:val="false"/>
+          <w:color w:val="1F2937"/>
+          <w:sz w:val="21"/>
+          <w:szCs w:val="21"/>
+        </w:rPr>
+        <w:t xml:space="preserve">第一阶段地域是否只写泉州南安，只说泉州是否明确排除。</w:t>
+      </w:r>
+    </w:p>
+    <w:p>
+      <w:pPr>
+        <w:pStyle w:val="ListParagraph"/>
+        <w:keepNext w:val="false"/>
+        <w:keepLines/>
+        <w:widowControl/>
+        <w:numPr>
+          <w:ilvl w:val="0"/>
+          <w:numId w:val="1"/>
+        </w:numPr>
+        <w:spacing w:after="70" w:before="0" w:line="360"/>
+      </w:pPr>
+      <w:r>
+        <w:rPr>
+          <w:rFonts w:ascii="Microsoft YaHei" w:cs="Microsoft YaHei" w:eastAsia="Microsoft YaHei" w:hAnsi="Microsoft YaHei"/>
+          <w:b w:val="false"/>
+          <w:bCs w:val="false"/>
+          <w:i w:val="false"/>
+          <w:iCs w:val="false"/>
+          <w:color w:val="1F2937"/>
+          <w:sz w:val="21"/>
+          <w:szCs w:val="21"/>
+        </w:rPr>
+        <w:t xml:space="preserve">问法是否无品牌、非诱导，不要求 AI 确诊或保证推荐。</w:t>
+      </w:r>
+    </w:p>
+    <w:p>
+      <w:pPr>
+        <w:pStyle w:val="ListParagraph"/>
+        <w:keepNext w:val="false"/>
+        <w:keepLines/>
+        <w:widowControl/>
+        <w:numPr>
+          <w:ilvl w:val="0"/>
+          <w:numId w:val="1"/>
+        </w:numPr>
+        <w:spacing w:after="70" w:before="0" w:line="360"/>
+      </w:pPr>
+      <w:r>
+        <w:rPr>
+          <w:rFonts w:ascii="Microsoft YaHei" w:cs="Microsoft YaHei" w:eastAsia="Microsoft YaHei" w:hAnsi="Microsoft YaHei"/>
+          <w:b w:val="false"/>
+          <w:bCs w:val="false"/>
+          <w:i w:val="false"/>
+          <w:iCs w:val="false"/>
+          <w:color w:val="1F2937"/>
+          <w:sz w:val="21"/>
+          <w:szCs w:val="21"/>
+        </w:rPr>
+        <w:t xml:space="preserve">P0 平台、事实依据、问题组、排除项和验收规则是否完整。</w:t>
+      </w:r>
+    </w:p>
+    <w:p>
+      <w:pPr>
+        <w:pStyle w:val="ListParagraph"/>
+        <w:keepNext w:val="false"/>
+        <w:keepLines/>
+        <w:widowControl/>
+        <w:numPr>
+          <w:ilvl w:val="0"/>
+          <w:numId w:val="1"/>
+        </w:numPr>
+        <w:spacing w:after="70" w:before="0" w:line="360"/>
+      </w:pPr>
+      <w:r>
+        <w:rPr>
+          <w:rFonts w:ascii="Microsoft YaHei" w:cs="Microsoft YaHei" w:eastAsia="Microsoft YaHei" w:hAnsi="Microsoft YaHei"/>
+          <w:b w:val="false"/>
+          <w:bCs w:val="false"/>
+          <w:i w:val="false"/>
+          <w:iCs w:val="false"/>
+          <w:color w:val="1F2937"/>
+          <w:sz w:val="21"/>
+          <w:szCs w:val="21"/>
+        </w:rPr>
+        <w:t xml:space="preserve">手机 App 与 API 是否严格分表。</w:t>
+      </w:r>
+    </w:p>
+    <w:p>
+      <w:pPr>
+        <w:pStyle w:val="ListParagraph"/>
+        <w:keepNext w:val="false"/>
+        <w:keepLines/>
+        <w:widowControl/>
+        <w:numPr>
+          <w:ilvl w:val="0"/>
+          <w:numId w:val="1"/>
+        </w:numPr>
+        <w:spacing w:after="70" w:before="0" w:line="360"/>
+      </w:pPr>
+      <w:r>
+        <w:rPr>
+          <w:rFonts w:ascii="Microsoft YaHei" w:cs="Microsoft YaHei" w:eastAsia="Microsoft YaHei" w:hAnsi="Microsoft YaHei"/>
+          <w:b w:val="false"/>
+          <w:bCs w:val="false"/>
+          <w:i w:val="false"/>
+          <w:iCs w:val="false"/>
+          <w:color w:val="1F2937"/>
+          <w:sz w:val="21"/>
+          <w:szCs w:val="21"/>
+        </w:rPr>
+        <w:t xml:space="preserve">结论范围是否仍限于诊断基线。</w:t>
       </w:r>
     </w:p>
     <w:p>
@@ -991,7 +798,111 @@
           <w:sz w:val="22"/>
           <w:szCs w:val="22"/>
         </w:rPr>
-        <w:t xml:space="preserve">第三步：交付复核意见</w:t>
+        <w:t xml:space="preserve">G1 回传格式</w:t>
+      </w:r>
+    </w:p>
+    <w:p>
+      <w:pPr>
+        <w:pStyle w:val="ListParagraph"/>
+        <w:keepNext w:val="false"/>
+        <w:keepLines/>
+        <w:widowControl/>
+        <w:numPr>
+          <w:ilvl w:val="0"/>
+          <w:numId w:val="1"/>
+        </w:numPr>
+        <w:spacing w:after="70" w:before="0" w:line="360"/>
+      </w:pPr>
+      <w:r>
+        <w:rPr>
+          <w:rFonts w:ascii="Microsoft YaHei" w:cs="Microsoft YaHei" w:eastAsia="Microsoft YaHei" w:hAnsi="Microsoft YaHei"/>
+          <w:b w:val="false"/>
+          <w:bCs w:val="false"/>
+          <w:i w:val="false"/>
+          <w:iCs w:val="false"/>
+          <w:color w:val="1F2937"/>
+          <w:sz w:val="21"/>
+          <w:szCs w:val="21"/>
+        </w:rPr>
+        <w:t xml:space="preserve">结论：通过 / 要改。</w:t>
+      </w:r>
+    </w:p>
+    <w:p>
+      <w:pPr>
+        <w:pStyle w:val="ListParagraph"/>
+        <w:keepNext w:val="false"/>
+        <w:keepLines/>
+        <w:widowControl/>
+        <w:numPr>
+          <w:ilvl w:val="0"/>
+          <w:numId w:val="1"/>
+        </w:numPr>
+        <w:spacing w:after="70" w:before="0" w:line="360"/>
+      </w:pPr>
+      <w:r>
+        <w:rPr>
+          <w:rFonts w:ascii="Microsoft YaHei" w:cs="Microsoft YaHei" w:eastAsia="Microsoft YaHei" w:hAnsi="Microsoft YaHei"/>
+          <w:b w:val="false"/>
+          <w:bCs w:val="false"/>
+          <w:i w:val="false"/>
+          <w:iCs w:val="false"/>
+          <w:color w:val="1F2937"/>
+          <w:sz w:val="21"/>
+          <w:szCs w:val="21"/>
+        </w:rPr>
+        <w:t xml:space="preserve">必改项：逐条引用问题句并给出改口建议。</w:t>
+      </w:r>
+    </w:p>
+    <w:p>
+      <w:pPr>
+        <w:pStyle w:val="ListParagraph"/>
+        <w:keepNext w:val="false"/>
+        <w:keepLines/>
+        <w:widowControl/>
+        <w:numPr>
+          <w:ilvl w:val="0"/>
+          <w:numId w:val="1"/>
+        </w:numPr>
+        <w:spacing w:after="70" w:before="0" w:line="360"/>
+      </w:pPr>
+      <w:r>
+        <w:rPr>
+          <w:rFonts w:ascii="Microsoft YaHei" w:cs="Microsoft YaHei" w:eastAsia="Microsoft YaHei" w:hAnsi="Microsoft YaHei"/>
+          <w:b w:val="false"/>
+          <w:bCs w:val="false"/>
+          <w:i w:val="false"/>
+          <w:iCs w:val="false"/>
+          <w:color w:val="1F2937"/>
+          <w:sz w:val="21"/>
+          <w:szCs w:val="21"/>
+        </w:rPr>
+        <w:t xml:space="preserve">待确认项：只列事实缺口，不自行补事实。</w:t>
+      </w:r>
+    </w:p>
+    <w:p>
+      <w:pPr>
+        <w:pStyle w:val="ListParagraph"/>
+        <w:keepNext w:val="false"/>
+        <w:keepLines/>
+        <w:widowControl/>
+        <w:numPr>
+          <w:ilvl w:val="0"/>
+          <w:numId w:val="1"/>
+        </w:numPr>
+        <w:spacing w:after="70" w:before="0" w:line="360"/>
+      </w:pPr>
+      <w:r>
+        <w:rPr>
+          <w:rFonts w:ascii="Microsoft YaHei" w:cs="Microsoft YaHei" w:eastAsia="Microsoft YaHei" w:hAnsi="Microsoft YaHei"/>
+          <w:b w:val="false"/>
+          <w:bCs w:val="false"/>
+          <w:i w:val="false"/>
+          <w:iCs w:val="false"/>
+          <w:color w:val="1F2937"/>
+          <w:sz w:val="21"/>
+          <w:szCs w:val="21"/>
+        </w:rPr>
+        <w:t xml:space="preserve">签名：L；本次角色为 G1 的 GEO / 验收专业复核。</w:t>
       </w:r>
     </w:p>
     <w:p>
@@ -1012,158 +923,7 @@
           <w:sz w:val="21"/>
           <w:szCs w:val="21"/>
         </w:rPr>
-        <w:t xml:space="preserve">输出格式：</w:t>
-      </w:r>
-    </w:p>
-    <w:p>
-      <w:pPr>
-        <w:pStyle w:val="ListParagraph"/>
-        <w:keepNext w:val="false"/>
-        <w:keepLines/>
-        <w:widowControl/>
-        <w:numPr>
-          <w:ilvl w:val="0"/>
-          <w:numId w:val="1"/>
-        </w:numPr>
-        <w:spacing w:after="70" w:before="0" w:line="360"/>
-      </w:pPr>
-      <w:r>
-        <w:rPr>
-          <w:rFonts w:ascii="Microsoft YaHei" w:cs="Microsoft YaHei" w:eastAsia="Microsoft YaHei" w:hAnsi="Microsoft YaHei"/>
-          <w:b w:val="false"/>
-          <w:bCs w:val="false"/>
-          <w:i w:val="false"/>
-          <w:iCs w:val="false"/>
-          <w:color w:val="1F2937"/>
-          <w:sz w:val="21"/>
-          <w:szCs w:val="21"/>
-        </w:rPr>
-        <w:t xml:space="preserve">结论：通过 / 要改。</w:t>
-      </w:r>
-    </w:p>
-    <w:p>
-      <w:pPr>
-        <w:pStyle w:val="ListParagraph"/>
-        <w:keepNext w:val="false"/>
-        <w:keepLines/>
-        <w:widowControl/>
-        <w:numPr>
-          <w:ilvl w:val="0"/>
-          <w:numId w:val="1"/>
-        </w:numPr>
-        <w:spacing w:after="70" w:before="0" w:line="360"/>
-      </w:pPr>
-      <w:r>
-        <w:rPr>
-          <w:rFonts w:ascii="Microsoft YaHei" w:cs="Microsoft YaHei" w:eastAsia="Microsoft YaHei" w:hAnsi="Microsoft YaHei"/>
-          <w:b w:val="false"/>
-          <w:bCs w:val="false"/>
-          <w:i w:val="false"/>
-          <w:iCs w:val="false"/>
-          <w:color w:val="1F2937"/>
-          <w:sz w:val="21"/>
-          <w:szCs w:val="21"/>
-        </w:rPr>
-        <w:t xml:space="preserve">必改项：逐条引用问题句并给出改口建议。</w:t>
-      </w:r>
-    </w:p>
-    <w:p>
-      <w:pPr>
-        <w:pStyle w:val="ListParagraph"/>
-        <w:keepNext w:val="false"/>
-        <w:keepLines/>
-        <w:widowControl/>
-        <w:numPr>
-          <w:ilvl w:val="0"/>
-          <w:numId w:val="1"/>
-        </w:numPr>
-        <w:spacing w:after="70" w:before="0" w:line="360"/>
-      </w:pPr>
-      <w:r>
-        <w:rPr>
-          <w:rFonts w:ascii="Microsoft YaHei" w:cs="Microsoft YaHei" w:eastAsia="Microsoft YaHei" w:hAnsi="Microsoft YaHei"/>
-          <w:b w:val="false"/>
-          <w:bCs w:val="false"/>
-          <w:i w:val="false"/>
-          <w:iCs w:val="false"/>
-          <w:color w:val="1F2937"/>
-          <w:sz w:val="21"/>
-          <w:szCs w:val="21"/>
-        </w:rPr>
-        <w:t xml:space="preserve">待确认项：只列事实缺口，不自行补事实。</w:t>
-      </w:r>
-    </w:p>
-    <w:p>
-      <w:pPr>
-        <w:pStyle w:val="ListParagraph"/>
-        <w:keepNext w:val="false"/>
-        <w:keepLines/>
-        <w:widowControl/>
-        <w:numPr>
-          <w:ilvl w:val="0"/>
-          <w:numId w:val="1"/>
-        </w:numPr>
-        <w:spacing w:after="70" w:before="0" w:line="360"/>
-      </w:pPr>
-      <w:r>
-        <w:rPr>
-          <w:rFonts w:ascii="Microsoft YaHei" w:cs="Microsoft YaHei" w:eastAsia="Microsoft YaHei" w:hAnsi="Microsoft YaHei"/>
-          <w:b w:val="false"/>
-          <w:bCs w:val="false"/>
-          <w:i w:val="false"/>
-          <w:iCs w:val="false"/>
-          <w:color w:val="1F2937"/>
-          <w:sz w:val="21"/>
-          <w:szCs w:val="21"/>
-        </w:rPr>
-        <w:t xml:space="preserve">路径核对：写明你检查过的原始材料和草稿路径。</w:t>
-      </w:r>
-    </w:p>
-    <w:p>
-      <w:pPr>
-        <w:pStyle w:val="ListParagraph"/>
-        <w:keepNext w:val="false"/>
-        <w:keepLines/>
-        <w:widowControl/>
-        <w:numPr>
-          <w:ilvl w:val="0"/>
-          <w:numId w:val="1"/>
-        </w:numPr>
-        <w:spacing w:after="70" w:before="0" w:line="360"/>
-      </w:pPr>
-      <w:r>
-        <w:rPr>
-          <w:rFonts w:ascii="Microsoft YaHei" w:cs="Microsoft YaHei" w:eastAsia="Microsoft YaHei" w:hAnsi="Microsoft YaHei"/>
-          <w:b w:val="false"/>
-          <w:bCs w:val="false"/>
-          <w:i w:val="false"/>
-          <w:iCs w:val="false"/>
-          <w:color w:val="1F2937"/>
-          <w:sz w:val="21"/>
-          <w:szCs w:val="21"/>
-        </w:rPr>
-        <w:t xml:space="preserve">签名：L；本次角色为“成员 / 01 独立复核”，不是 G1、G3、G4 或 G8 的正式第二角色。</w:t>
-      </w:r>
-    </w:p>
-    <w:p>
-      <w:pPr>
-        <w:keepNext w:val="false"/>
-        <w:keepLines/>
-        <w:widowControl/>
-        <w:spacing w:after="120" w:before="0" w:line="360"/>
-      </w:pPr>
-      <w:r>
-        <w:rPr>
-          <w:rFonts w:ascii="Microsoft YaHei" w:cs="Microsoft YaHei" w:eastAsia="Microsoft YaHei" w:hAnsi="Microsoft YaHei"/>
-          <w:b w:val="false"/>
-          <w:bCs w:val="false"/>
-          <w:i w:val="false"/>
-          <w:iCs w:val="false"/>
-          <w:color w:val="1F2937"/>
-          <w:sz w:val="21"/>
-          <w:szCs w:val="21"/>
-        </w:rPr>
-        <w:t xml:space="preserve">将复核意见交给 W。你不能代替 W 批准 G0。</w:t>
+        <w:t xml:space="preserve">将 G1 意见交给 W。W 与 L 分别签署后，项目才能进入 07 预算。</w:t>
       </w:r>
     </w:p>
     <w:p>
@@ -1451,7 +1211,7 @@
           <w:sz w:val="21"/>
           <w:szCs w:val="21"/>
         </w:rPr>
-        <w:t xml:space="preserve">开始条件：必须先完成 G0、G1、G6、G7，并形成冻结包。现在仍在 G0 前，暂时不能开始手机采集。</w:t>
+        <w:t xml:space="preserve">开始条件：G0 已完成；仍须完成 G1、G6、G7 并形成冻结包。当前处于 G1 前，暂时不能开始手机采集。</w:t>
       </w:r>
     </w:p>
     <w:p>
@@ -3418,189 +3178,137 @@
           <w:sz w:val="24"/>
           <w:szCs w:val="24"/>
         </w:rPr>
-        <w:t xml:space="preserve">10. 你的首日完成清单</w:t>
-      </w:r>
-    </w:p>
-    <w:p>
-      <w:pPr>
-        <w:pStyle w:val="ListParagraph"/>
-        <w:keepNext w:val="false"/>
-        <w:keepLines/>
-        <w:widowControl/>
-        <w:numPr>
-          <w:ilvl w:val="0"/>
-          <w:numId w:val="1"/>
-        </w:numPr>
-        <w:spacing w:after="70" w:before="0" w:line="360"/>
-      </w:pPr>
-      <w:r>
-        <w:rPr>
-          <w:rFonts w:ascii="Microsoft YaHei" w:cs="Microsoft YaHei" w:eastAsia="Microsoft YaHei" w:hAnsi="Microsoft YaHei"/>
-          <w:b w:val="false"/>
-          <w:bCs w:val="false"/>
-          <w:i w:val="false"/>
-          <w:iCs w:val="false"/>
-          <w:color w:val="1F2937"/>
-          <w:sz w:val="21"/>
-          <w:szCs w:val="21"/>
-        </w:rPr>
-        <w:t xml:space="preserve">[ ] 已读当前 01 节点的三份必读材料。</w:t>
-      </w:r>
-    </w:p>
-    <w:p>
-      <w:pPr>
-        <w:pStyle w:val="ListParagraph"/>
-        <w:keepNext w:val="false"/>
-        <w:keepLines/>
-        <w:widowControl/>
-        <w:numPr>
-          <w:ilvl w:val="0"/>
-          <w:numId w:val="1"/>
-        </w:numPr>
-        <w:spacing w:after="70" w:before="0" w:line="360"/>
-      </w:pPr>
-      <w:r>
-        <w:rPr>
-          <w:rFonts w:ascii="Microsoft YaHei" w:cs="Microsoft YaHei" w:eastAsia="Microsoft YaHei" w:hAnsi="Microsoft YaHei"/>
-          <w:b w:val="false"/>
-          <w:bCs w:val="false"/>
-          <w:i w:val="false"/>
-          <w:iCs w:val="false"/>
-          <w:color w:val="1F2937"/>
-          <w:sz w:val="21"/>
-          <w:szCs w:val="21"/>
-        </w:rPr>
-        <w:t xml:space="preserve">[ ] 能用自己的话说明“提及”和“推荐”的区别。</w:t>
-      </w:r>
-    </w:p>
-    <w:p>
-      <w:pPr>
-        <w:pStyle w:val="ListParagraph"/>
-        <w:keepNext w:val="false"/>
-        <w:keepLines/>
-        <w:widowControl/>
-        <w:numPr>
-          <w:ilvl w:val="0"/>
-          <w:numId w:val="1"/>
-        </w:numPr>
-        <w:spacing w:after="70" w:before="0" w:line="360"/>
-      </w:pPr>
-      <w:r>
-        <w:rPr>
-          <w:rFonts w:ascii="Microsoft YaHei" w:cs="Microsoft YaHei" w:eastAsia="Microsoft YaHei" w:hAnsi="Microsoft YaHei"/>
-          <w:b w:val="false"/>
-          <w:bCs w:val="false"/>
-          <w:i w:val="false"/>
-          <w:iCs w:val="false"/>
-          <w:color w:val="1F2937"/>
-          <w:sz w:val="21"/>
-          <w:szCs w:val="21"/>
-        </w:rPr>
-        <w:t xml:space="preserve">[ ] 能指出客户原话中医疗诊断、位置隐私和保证推荐风险。</w:t>
-      </w:r>
-    </w:p>
-    <w:p>
-      <w:pPr>
-        <w:pStyle w:val="ListParagraph"/>
-        <w:keepNext w:val="false"/>
-        <w:keepLines/>
-        <w:widowControl/>
-        <w:numPr>
-          <w:ilvl w:val="0"/>
-          <w:numId w:val="1"/>
-        </w:numPr>
-        <w:spacing w:after="70" w:before="0" w:line="360"/>
-      </w:pPr>
-      <w:r>
-        <w:rPr>
-          <w:rFonts w:ascii="Microsoft YaHei" w:cs="Microsoft YaHei" w:eastAsia="Microsoft YaHei" w:hAnsi="Microsoft YaHei"/>
-          <w:b w:val="false"/>
-          <w:bCs w:val="false"/>
-          <w:i w:val="false"/>
-          <w:iCs w:val="false"/>
-          <w:color w:val="1F2937"/>
-          <w:sz w:val="21"/>
-          <w:szCs w:val="21"/>
-        </w:rPr>
-        <w:t xml:space="preserve">[ ] 能说明“泉州南安”与“整个泉州”的范围差异，并检查只说“泉州”时不进入本阶段。</w:t>
-      </w:r>
-    </w:p>
-    <w:p>
-      <w:pPr>
-        <w:pStyle w:val="ListParagraph"/>
-        <w:keepNext w:val="false"/>
-        <w:keepLines/>
-        <w:widowControl/>
-        <w:numPr>
-          <w:ilvl w:val="0"/>
-          <w:numId w:val="1"/>
-        </w:numPr>
-        <w:spacing w:after="70" w:before="0" w:line="360"/>
-      </w:pPr>
-      <w:r>
-        <w:rPr>
-          <w:rFonts w:ascii="Microsoft YaHei" w:cs="Microsoft YaHei" w:eastAsia="Microsoft YaHei" w:hAnsi="Microsoft YaHei"/>
-          <w:b w:val="false"/>
-          <w:bCs w:val="false"/>
-          <w:i w:val="false"/>
-          <w:iCs w:val="false"/>
-          <w:color w:val="1F2937"/>
-          <w:sz w:val="21"/>
-          <w:szCs w:val="21"/>
-        </w:rPr>
-        <w:t xml:space="preserve">[ ] 已检查商机卡五项质量。</w:t>
-      </w:r>
-    </w:p>
-    <w:p>
-      <w:pPr>
-        <w:pStyle w:val="ListParagraph"/>
-        <w:keepNext w:val="false"/>
-        <w:keepLines/>
-        <w:widowControl/>
-        <w:numPr>
-          <w:ilvl w:val="0"/>
-          <w:numId w:val="1"/>
-        </w:numPr>
-        <w:spacing w:after="70" w:before="0" w:line="360"/>
-      </w:pPr>
-      <w:r>
-        <w:rPr>
-          <w:rFonts w:ascii="Microsoft YaHei" w:cs="Microsoft YaHei" w:eastAsia="Microsoft YaHei" w:hAnsi="Microsoft YaHei"/>
-          <w:b w:val="false"/>
-          <w:bCs w:val="false"/>
-          <w:i w:val="false"/>
-          <w:iCs w:val="false"/>
-          <w:color w:val="1F2937"/>
-          <w:sz w:val="21"/>
-          <w:szCs w:val="21"/>
-        </w:rPr>
-        <w:t xml:space="preserve">[ ] 已向 W 提交“通过 / 要改”复核意见。</w:t>
-      </w:r>
-    </w:p>
-    <w:p>
-      <w:pPr>
-        <w:pStyle w:val="ListParagraph"/>
-        <w:keepNext w:val="false"/>
-        <w:keepLines/>
-        <w:widowControl/>
-        <w:numPr>
-          <w:ilvl w:val="0"/>
-          <w:numId w:val="1"/>
-        </w:numPr>
-        <w:spacing w:after="70" w:before="0" w:line="360"/>
-      </w:pPr>
-      <w:r>
-        <w:rPr>
-          <w:rFonts w:ascii="Microsoft YaHei" w:cs="Microsoft YaHei" w:eastAsia="Microsoft YaHei" w:hAnsi="Microsoft YaHei"/>
-          <w:b w:val="false"/>
-          <w:bCs w:val="false"/>
-          <w:i w:val="false"/>
-          <w:iCs w:val="false"/>
-          <w:color w:val="1F2937"/>
-          <w:sz w:val="21"/>
-          <w:szCs w:val="21"/>
-        </w:rPr>
-        <w:t xml:space="preserve">[ ] 未进入 02，未开始采集，未修改任何正式现行文件。</w:t>
+        <w:t xml:space="preserve">10. 当前阶段完成清单</w:t>
+      </w:r>
+    </w:p>
+    <w:p>
+      <w:pPr>
+        <w:pStyle w:val="ListParagraph"/>
+        <w:keepNext w:val="false"/>
+        <w:keepLines/>
+        <w:widowControl/>
+        <w:numPr>
+          <w:ilvl w:val="0"/>
+          <w:numId w:val="1"/>
+        </w:numPr>
+        <w:spacing w:after="70" w:before="0" w:line="360"/>
+      </w:pPr>
+      <w:r>
+        <w:rPr>
+          <w:rFonts w:ascii="Microsoft YaHei" w:cs="Microsoft YaHei" w:eastAsia="Microsoft YaHei" w:hAnsi="Microsoft YaHei"/>
+          <w:b w:val="false"/>
+          <w:bCs w:val="false"/>
+          <w:i w:val="false"/>
+          <w:iCs w:val="false"/>
+          <w:color w:val="1F2937"/>
+          <w:sz w:val="21"/>
+          <w:szCs w:val="21"/>
+        </w:rPr>
+        <w:t xml:space="preserve">[x] 已完成 01 地域口径重审并回传 R0008。</w:t>
+      </w:r>
+    </w:p>
+    <w:p>
+      <w:pPr>
+        <w:pStyle w:val="ListParagraph"/>
+        <w:keepNext w:val="false"/>
+        <w:keepLines/>
+        <w:widowControl/>
+        <w:numPr>
+          <w:ilvl w:val="0"/>
+          <w:numId w:val="1"/>
+        </w:numPr>
+        <w:spacing w:after="70" w:before="0" w:line="360"/>
+      </w:pPr>
+      <w:r>
+        <w:rPr>
+          <w:rFonts w:ascii="Microsoft YaHei" w:cs="Microsoft YaHei" w:eastAsia="Microsoft YaHei" w:hAnsi="Microsoft YaHei"/>
+          <w:b w:val="false"/>
+          <w:bCs w:val="false"/>
+          <w:i w:val="false"/>
+          <w:iCs w:val="false"/>
+          <w:color w:val="1F2937"/>
+          <w:sz w:val="21"/>
+          <w:szCs w:val="21"/>
+        </w:rPr>
+        <w:t xml:space="preserve">[x] 知道 G0 已由 W 批准，项目进入 02。</w:t>
+      </w:r>
+    </w:p>
+    <w:p>
+      <w:pPr>
+        <w:pStyle w:val="ListParagraph"/>
+        <w:keepNext w:val="false"/>
+        <w:keepLines/>
+        <w:widowControl/>
+        <w:numPr>
+          <w:ilvl w:val="0"/>
+          <w:numId w:val="1"/>
+        </w:numPr>
+        <w:spacing w:after="70" w:before="0" w:line="360"/>
+      </w:pPr>
+      <w:r>
+        <w:rPr>
+          <w:rFonts w:ascii="Microsoft YaHei" w:cs="Microsoft YaHei" w:eastAsia="Microsoft YaHei" w:hAnsi="Microsoft YaHei"/>
+          <w:b w:val="false"/>
+          <w:bCs w:val="false"/>
+          <w:i w:val="false"/>
+          <w:iCs w:val="false"/>
+          <w:color w:val="1F2937"/>
+          <w:sz w:val="21"/>
+          <w:szCs w:val="21"/>
+        </w:rPr>
+        <w:t xml:space="preserve">[ ] 已阅读 02 需求冻结启动清单。</w:t>
+      </w:r>
+    </w:p>
+    <w:p>
+      <w:pPr>
+        <w:pStyle w:val="ListParagraph"/>
+        <w:keepNext w:val="false"/>
+        <w:keepLines/>
+        <w:widowControl/>
+        <w:numPr>
+          <w:ilvl w:val="0"/>
+          <w:numId w:val="1"/>
+        </w:numPr>
+        <w:spacing w:after="70" w:before="0" w:line="360"/>
+      </w:pPr>
+      <w:r>
+        <w:rPr>
+          <w:rFonts w:ascii="Microsoft YaHei" w:cs="Microsoft YaHei" w:eastAsia="Microsoft YaHei" w:hAnsi="Microsoft YaHei"/>
+          <w:b w:val="false"/>
+          <w:bCs w:val="false"/>
+          <w:i w:val="false"/>
+          <w:iCs w:val="false"/>
+          <w:color w:val="1F2937"/>
+          <w:sz w:val="21"/>
+          <w:szCs w:val="21"/>
+        </w:rPr>
+        <w:t xml:space="preserve">[ ] 收到 02 草稿后完成 G1 独立审核。</w:t>
+      </w:r>
+    </w:p>
+    <w:p>
+      <w:pPr>
+        <w:pStyle w:val="ListParagraph"/>
+        <w:keepNext w:val="false"/>
+        <w:keepLines/>
+        <w:widowControl/>
+        <w:numPr>
+          <w:ilvl w:val="0"/>
+          <w:numId w:val="1"/>
+        </w:numPr>
+        <w:spacing w:after="70" w:before="0" w:line="360"/>
+      </w:pPr>
+      <w:r>
+        <w:rPr>
+          <w:rFonts w:ascii="Microsoft YaHei" w:cs="Microsoft YaHei" w:eastAsia="Microsoft YaHei" w:hAnsi="Microsoft YaHei"/>
+          <w:b w:val="false"/>
+          <w:bCs w:val="false"/>
+          <w:i w:val="false"/>
+          <w:iCs w:val="false"/>
+          <w:color w:val="1F2937"/>
+          <w:sz w:val="21"/>
+          <w:szCs w:val="21"/>
+        </w:rPr>
+        <w:t xml:space="preserve">[ ] 未在 G1、G6、G7 完成前开始手机采集。</w:t>
       </w:r>
     </w:p>
     <w:p>
@@ -3811,7 +3519,7 @@
           <w:sz w:val="21"/>
           <w:szCs w:val="21"/>
         </w:rPr>
-        <w:t xml:space="preserve">我已阅读当前 01 节点材料，知道本案只做诊断，不保证推荐，不把症状当作确诊，不擅自读取位置；第一阶段只覆盖泉州南安，仅说“泉州”不纳入。我将在各阶段承担分配给 L 的执行任务，并在 03 阶段亲自使用真实手机完成 App 冷会话采集；由 W 独立评分和验收。在 G0 通过前，我不会提前采集或进入下一阶段。</w:t>
+        <w:t xml:space="preserve">我知道 G0 已通过，项目现处于 02 需求冻结；本案只做诊断，不保证推荐，不把症状当作确诊，不擅自读取位置，第一阶段只覆盖泉州南安。我将在收到 02 草稿后完成 G1 独立审核；在 G1、G6、G7 完成前不开始手机 App 采集。</w:t>
       </w:r>
     </w:p>
     <w:p>

</xml_diff>

<commit_message>
feat: register Binhai hospital institution facts
</commit_message>
<xml_diff>
--- a/binhai-hospital-geo-diagnosis/working-documents/全阶段_审核成员项目协作交接手册_2026-08-23.docx
+++ b/binhai-hospital-geo-diagnosis/working-documents/全阶段_审核成员项目协作交接手册_2026-08-23.docx
@@ -25,13 +25,7 @@
         <w:jc w:val="center"/>
       </w:pPr>
       <w:r>
-        <w:rPr>
-          <w:rFonts w:ascii="Microsoft YaHei" w:cs="Microsoft YaHei" w:eastAsia="Microsoft YaHei" w:hAnsi="Microsoft YaHei"/>
-          <w:color w:val="5D7380"/>
-          <w:sz w:val="19"/>
-          <w:szCs w:val="19"/>
-        </w:rPr>
-        <w:t xml:space="preserve">滨海医院 GEO 诊断项目｜更新日期：2026-08-23</w:t>
+        <w:t>滨海医院 GEO 诊断项目｜更新日期：2026-08-24</w:t>
       </w:r>
     </w:p>
     <w:p>
@@ -145,17 +139,7 @@
         <w:spacing w:after="120" w:before="0" w:line="360"/>
       </w:pPr>
       <w:r>
-        <w:rPr>
-          <w:rFonts w:ascii="Microsoft YaHei" w:cs="Microsoft YaHei" w:eastAsia="Microsoft YaHei" w:hAnsi="Microsoft YaHei"/>
-          <w:b w:val="false"/>
-          <w:bCs w:val="false"/>
-          <w:i w:val="false"/>
-          <w:iCs w:val="false"/>
-          <w:color w:val="1F2937"/>
-          <w:sz w:val="21"/>
-          <w:szCs w:val="21"/>
-        </w:rPr>
-        <w:t xml:space="preserve">更新日期：2026-08-23</w:t>
+        <w:t>更新日期：2026-08-24</w:t>
       </w:r>
     </w:p>
     <w:p>
@@ -303,17 +287,7 @@
         <w:spacing w:after="70" w:before="0" w:line="360"/>
       </w:pPr>
       <w:r>
-        <w:rPr>
-          <w:rFonts w:ascii="Microsoft YaHei" w:cs="Microsoft YaHei" w:eastAsia="Microsoft YaHei" w:hAnsi="Microsoft YaHei"/>
-          <w:b w:val="false"/>
-          <w:bCs w:val="false"/>
-          <w:i w:val="false"/>
-          <w:iCs w:val="false"/>
-          <w:color w:val="1F2937"/>
-          <w:sz w:val="21"/>
-          <w:szCs w:val="21"/>
-        </w:rPr>
-        <w:t xml:space="preserve">已有材料：R0001—R0004 客户与范围依据、R0008 审核通过回传、G0 负责人批准记录，以及 02 需求冻结启动清单。</w:t>
+        <w:t>已有材料：R0001—R0004 客户与范围依据、R0008 审核通过回传、G0 负责人批准记录、R0009—R0010 项目组机构信息及转录，以及 02 需求冻结启动清单和机构事实清单。</w:t>
       </w:r>
     </w:p>
     <w:p>
@@ -355,17 +329,7 @@
         <w:spacing w:after="70" w:before="0" w:line="360"/>
       </w:pPr>
       <w:r>
-        <w:rPr>
-          <w:rFonts w:ascii="Microsoft YaHei" w:cs="Microsoft YaHei" w:eastAsia="Microsoft YaHei" w:hAnsi="Microsoft YaHei"/>
-          <w:b w:val="false"/>
-          <w:bCs w:val="false"/>
-          <w:i w:val="false"/>
-          <w:iCs w:val="false"/>
-          <w:color w:val="1F2937"/>
-          <w:sz w:val="21"/>
-          <w:szCs w:val="21"/>
-        </w:rPr>
-        <w:t xml:space="preserve">当前等待：W 补充机构官方事实、P0 平台和测评预算范围；Agent 随后起草 02 冻结材料。</w:t>
+        <w:t>当前等待：W 对 R0009—R0010 中的机构事实完成官方来源复核，并补充 P0 平台、测评预算范围、客户窗口和监测对照规则；Agent 随后起草 02 冻结材料。</w:t>
       </w:r>
     </w:p>
     <w:p>
@@ -594,17 +558,15 @@
         <w:spacing w:after="70" w:before="0" w:line="360"/>
       </w:pPr>
       <w:r>
-        <w:rPr>
-          <w:rFonts w:ascii="Microsoft YaHei" w:cs="Microsoft YaHei" w:eastAsia="Microsoft YaHei" w:hAnsi="Microsoft YaHei"/>
-          <w:b w:val="false"/>
-          <w:bCs w:val="false"/>
-          <w:i w:val="false"/>
-          <w:iCs w:val="false"/>
-          <w:color w:val="1F2937"/>
-          <w:sz w:val="21"/>
-          <w:szCs w:val="21"/>
-        </w:rPr>
-        <w:t xml:space="preserve">working-documents/02_需求冻结启动清单_G1前草稿_2026-08-23.md</w:t>
+        <w:t>working-documents/02_需求冻结启动清单_G1前草稿_2026-08-24.md</w:t>
+      </w:r>
+    </w:p>
+    <w:p>
+      <w:pPr>
+        <w:pStyle w:val="ListParagraph"/>
+      </w:pPr>
+      <w:r>
+        <w:t>working-documents/02_医院机构事实清单_G1前草稿_2026-08-24.md</w:t>
       </w:r>
     </w:p>
     <w:p>

</xml_diff>